<commit_message>
Place the TOC graphic on the manuscript's last page
ACS asks for the TOC graphic on the last page, labelled, without a caption.
Added to both the marked and clean manuscripts at 3.3 x 1.8 inches.

Two faults found by validation and fixed before committing: a lazy regex
anchored to the first <w:sectPr> in the file, which is a section break inside a
paragraph's properties rather than the body-level one, so the image landed
somewhere a paragraph is not allowed; and the DrawingML namespaces a: and pic:
are not declared in a document that has never contained an inline image, so
they are now added when needed. The script is idempotent on the 'TOC Graphic'
label and will not stack duplicates on re-runs.

Co-Authored-By: Claude Opus 5 <noreply@anthropic.com>
</commit_message>
<xml_diff>
--- a/revisions/Manuscript-Revision-1-CLEAN.docx
+++ b/revisions/Manuscript-Revision-1-CLEAN.docx
@@ -1,6 +1,6 @@
 
 <file path=word/document.xml><?xml version="1.0" encoding="utf-8"?>
-<w:document xmlns:wpc="http://schemas.microsoft.com/office/word/2010/wordprocessingCanvas" xmlns:cx="http://schemas.microsoft.com/office/drawing/2014/chartex" xmlns:cx1="http://schemas.microsoft.com/office/drawing/2015/9/8/chartex" xmlns:cx2="http://schemas.microsoft.com/office/drawing/2015/10/21/chartex" xmlns:cx3="http://schemas.microsoft.com/office/drawing/2016/5/9/chartex" xmlns:cx4="http://schemas.microsoft.com/office/drawing/2016/5/10/chartex" xmlns:cx5="http://schemas.microsoft.com/office/drawing/2016/5/11/chartex" xmlns:cx6="http://schemas.microsoft.com/office/drawing/2016/5/12/chartex" xmlns:cx7="http://schemas.microsoft.com/office/drawing/2016/5/13/chartex" xmlns:cx8="http://schemas.microsoft.com/office/drawing/2016/5/14/chartex" xmlns:mc="http://schemas.openxmlformats.org/markup-compatibility/2006" xmlns:m="http://schemas.openxmlformats.org/officeDocument/2006/math" xmlns:aink="http://schemas.microsoft.com/office/drawing/2016/ink" xmlns:am3d="http://schemas.microsoft.com/office/drawing/2017/model3d" xmlns:oel="http://schemas.microsoft.com/office/2019/extlst" xmlns:r="http://schemas.openxmlformats.org/officeDocument/2006/relationships" xmlns:wp14="http://schemas.microsoft.com/office/word/2010/wordprocessingDrawing" xmlns:wp="http://schemas.openxmlformats.org/drawingml/2006/wordprocessingDrawing" xmlns:wpg="http://schemas.microsoft.com/office/word/2010/wordprocessingGroup" xmlns:wpi="http://schemas.microsoft.com/office/word/2010/wordprocessingInk" xmlns:wps="http://schemas.microsoft.com/office/word/2010/wordprocessingShape" xmlns:o="urn:schemas-microsoft-com:office:office" xmlns:v="urn:schemas-microsoft-com:vml" xmlns:w10="urn:schemas-microsoft-com:office:word" xmlns:w="http://schemas.openxmlformats.org/wordprocessingml/2006/main" xmlns:w14="http://schemas.microsoft.com/office/word/2010/wordml" xmlns:w15="http://schemas.microsoft.com/office/word/2012/wordml" xmlns:w16cex="http://schemas.microsoft.com/office/word/2018/wordml/cex" xmlns:w16cid="http://schemas.microsoft.com/office/word/2016/wordml/cid" xmlns:w16="http://schemas.microsoft.com/office/word/2018/wordml" xmlns:w16sdtdh="http://schemas.microsoft.com/office/word/2020/wordml/sdtdatahash" xmlns:w16sdtfl="http://schemas.microsoft.com/office/word/2024/wordml/sdtformatlock" xmlns:w16se="http://schemas.microsoft.com/office/word/2015/wordml/symex" xmlns:w16du="http://schemas.microsoft.com/office/word/2023/wordml/word16du" xmlns:wne="http://schemas.microsoft.com/office/word/2006/wordml" mc:Ignorable="w14 w15 w16se w16cid w16 w16cex w16sdtdh w16sdtfl w16du wp14">
+<w:document xmlns:wpc="http://schemas.microsoft.com/office/word/2010/wordprocessingCanvas" xmlns:cx="http://schemas.microsoft.com/office/drawing/2014/chartex" xmlns:cx1="http://schemas.microsoft.com/office/drawing/2015/9/8/chartex" xmlns:cx2="http://schemas.microsoft.com/office/drawing/2015/10/21/chartex" xmlns:cx3="http://schemas.microsoft.com/office/drawing/2016/5/9/chartex" xmlns:cx4="http://schemas.microsoft.com/office/drawing/2016/5/10/chartex" xmlns:cx5="http://schemas.microsoft.com/office/drawing/2016/5/11/chartex" xmlns:cx6="http://schemas.microsoft.com/office/drawing/2016/5/12/chartex" xmlns:cx7="http://schemas.microsoft.com/office/drawing/2016/5/13/chartex" xmlns:cx8="http://schemas.microsoft.com/office/drawing/2016/5/14/chartex" xmlns:mc="http://schemas.openxmlformats.org/markup-compatibility/2006" xmlns:m="http://schemas.openxmlformats.org/officeDocument/2006/math" xmlns:aink="http://schemas.microsoft.com/office/drawing/2016/ink" xmlns:am3d="http://schemas.microsoft.com/office/drawing/2017/model3d" xmlns:oel="http://schemas.microsoft.com/office/2019/extlst" xmlns:r="http://schemas.openxmlformats.org/officeDocument/2006/relationships" xmlns:wp14="http://schemas.microsoft.com/office/word/2010/wordprocessingDrawing" xmlns:wp="http://schemas.openxmlformats.org/drawingml/2006/wordprocessingDrawing" xmlns:wpg="http://schemas.microsoft.com/office/word/2010/wordprocessingGroup" xmlns:wpi="http://schemas.microsoft.com/office/word/2010/wordprocessingInk" xmlns:wps="http://schemas.microsoft.com/office/word/2010/wordprocessingShape" xmlns:o="urn:schemas-microsoft-com:office:office" xmlns:v="urn:schemas-microsoft-com:vml" xmlns:w10="urn:schemas-microsoft-com:office:word" xmlns:w="http://schemas.openxmlformats.org/wordprocessingml/2006/main" xmlns:w14="http://schemas.microsoft.com/office/word/2010/wordml" xmlns:w15="http://schemas.microsoft.com/office/word/2012/wordml" xmlns:w16cex="http://schemas.microsoft.com/office/word/2018/wordml/cex" xmlns:w16cid="http://schemas.microsoft.com/office/word/2016/wordml/cid" xmlns:w16="http://schemas.microsoft.com/office/word/2018/wordml" xmlns:w16sdtdh="http://schemas.microsoft.com/office/word/2020/wordml/sdtdatahash" xmlns:w16sdtfl="http://schemas.microsoft.com/office/word/2024/wordml/sdtformatlock" xmlns:w16se="http://schemas.microsoft.com/office/word/2015/wordml/symex" xmlns:w16du="http://schemas.microsoft.com/office/word/2023/wordml/word16du" xmlns:wne="http://schemas.microsoft.com/office/word/2006/wordml" xmlns:a="http://schemas.openxmlformats.org/drawingml/2006/main" xmlns:pic="http://schemas.openxmlformats.org/drawingml/2006/picture" mc:Ignorable="w14 w15 w16se w16cid w16 w16cex w16sdtdh w16sdtfl w16du wp14">
   <w:body>
     <w:p>
       <w:pPr>
@@ -31850,6 +31850,57 @@
           <w:rFonts w:ascii="Times New Roman" w:hAnsi="Times New Roman"/>
         </w:rPr>
         <w:fldChar w:fldCharType="end"/>
+      </w:r>
+    </w:p>
+    <w:p>
+      <w:r>
+        <w:br w:type="page"/>
+      </w:r>
+    </w:p>
+    <w:p>
+      <w:pPr>
+        <w:spacing w:after="240"/>
+      </w:pPr>
+      <w:r>
+        <w:rPr>
+          <w:b/>
+        </w:rPr>
+        <w:t>TOC Graphic</w:t>
+      </w:r>
+    </w:p>
+    <w:p>
+      <w:r>
+        <w:drawing>
+          <wp:inline distT="0" distB="0" distL="0" distR="0">
+            <wp:extent cx="3017520" cy="1645920"/>
+            <wp:docPr id="1001" name="TOC Graphic"/>
+            <a:graphic xmlns:a="http://schemas.openxmlformats.org/drawingml/2006/main">
+              <a:graphicData uri="http://schemas.openxmlformats.org/drawingml/2006/picture">
+                <pic:pic xmlns:pic="http://schemas.openxmlformats.org/drawingml/2006/picture">
+                  <pic:nvPicPr>
+                    <pic:cNvPr id="1001" name="TOC Graphic"/>
+                    <pic:cNvPicPr/>
+                  </pic:nvPicPr>
+                  <pic:blipFill>
+                    <a:blip r:embed="rId21"/>
+                    <a:stretch>
+                      <a:fillRect/>
+                    </a:stretch>
+                  </pic:blipFill>
+                  <pic:spPr>
+                    <a:xfrm>
+                      <a:off x="0" y="0"/>
+                      <a:ext cx="3017520" cy="1645920"/>
+                    </a:xfrm>
+                    <a:prstGeom prst="rect">
+                      <a:avLst/>
+                    </a:prstGeom>
+                  </pic:spPr>
+                </pic:pic>
+              </a:graphicData>
+            </a:graphic>
+          </wp:inline>
+        </w:drawing>
       </w:r>
     </w:p>
     <w:sectPr>

</xml_diff>

<commit_message>
Prose pass over the added manuscript text
The editor raised written English, so the ~1,100 words added in this revision
were audited. Mostly clean: no inflated vocabulary, no em-dash splices, correct
en-dashes in ranges. Two genuine faults fixed:

  'The sampling is likewise a real limitation rather than a formality.'
  -> 'The sampling is a limitation of a different kind.'
  'real X rather than Y' is an empty intensifier on a manufactured contrast.

  'We state this rather than present the minimized values as
  protocol-independent.' -> deleted. It announces our own candour; the
  preceding sentence already states the sensitivity, which is the content.

Co-Authored-By: Claude Opus 5 <noreply@anthropic.com>
</commit_message>
<xml_diff>
--- a/revisions/Manuscript-Revision-1-CLEAN.docx
+++ b/revisions/Manuscript-Revision-1-CLEAN.docx
@@ -2761,7 +2761,7 @@
         <w:t>under single-point evaluation and under hydrogen-only relaxation with heavy atoms restrained (Supplementary Table 5).</w:t>
       </w:r>
       <w:r>
-        <w:t xml:space="preserve"> That comparison shows ΔΔETotal to be materially sensitive to the choice. Single-point evaluation is dominated by residual steric contacts, with the excess confined to the van der Waals component, and hydrogen-only relaxation leaves replicate uncertainties as large as the WT-referenced shifts themselves, whereas the values reported here have replicate standard errors of 0.13 to 0.54 kcal/mol. We state this rather than present the minimized values as protocol-independent. It bears on the MM/GBSA column only: ΔΔGbind, which carries the principal claim, is an alchemical free energy and involves no snapshot minimization.</w:t>
+        <w:t xml:space="preserve"> That comparison shows ΔΔETotal to be materially sensitive to the choice. Single-point evaluation is dominated by residual steric contacts, with the excess confined to the van der Waals component, and hydrogen-only relaxation leaves replicate uncertainties as large as the WT-referenced shifts themselves, whereas the values reported here have replicate standard errors of 0.13 to 0.54 kcal/mol. It bears on the MM/GBSA column only: ΔΔGbind, which carries the principal claim, is an alchemical free energy and involves no snapshot minimization.</w:t>
       </w:r>
     </w:p>
     <w:p>
@@ -24305,7 +24305,7 @@
         <w:spacing w:after="240"/>
       </w:pPr>
       <w:r>
-        <w:t xml:space="preserve">The sampling is likewise a real limitation rather than a formality. Three 100 ns replicates are long relative to the local relaxation of the DOR pose, which converges within the first few </w:t>
+        <w:t xml:space="preserve">The sampling is a limitation of a different kind. Three 100 ns replicates are long relative to the local relaxation of the DOR pose, which converges within the first few </w:t>
       </w:r>
       <w:r>
         <w:lastRenderedPageBreak/>

</xml_diff>

<commit_message>
Reword the Methods equation preamble; x1 read as a citation
The literal-citation check flagged 'x1' in 'a time series x1 ... xN'. It is a
subscript, not a reference, but rather than widen the checker the sentence now
reads 'a series of N successive frames ... with values xt and mean x-bar',
which is clearer anyway. 45/45.
</commit_message>
<xml_diff>
--- a/revisions/Manuscript-Revision-1-CLEAN.docx
+++ b/revisions/Manuscript-Revision-1-CLEAN.docx
@@ -2123,11 +2123,8 @@
         </w:rPr>
       </w:pPr>
       <w:r>
-        <w:t xml:space="preserve">DOR pose root mean squared deviation (RMSD) was computed after protein-pocket alignment from DOR heavy atoms relative to the crystallographic pose, and the DOR–RT center-of-mass </w:t>
-      </w:r>
-      <w:r>
         <w:lastRenderedPageBreak/>
-        <w:t>distance as the separation between the center of mass of DOR and that of the protein. Residue–DOR proximity was computed as the minimum heavy-atom distance between DOR and each specified RT residue; named interactions between specific atoms, such as the hydrogen bond between the Lys103 main-chain carbonyl oxygen and the DOR triazolinone nitrogen, were measured as the distance between those two atoms directly.</w:t>
+        <w:t>DOR pose root mean squared deviation (RMSD) was computed after protein-pocket alignment from DOR heavy atoms relative to the crystallographic pose, and the DOR–RT center-of-mass distance as the separation between the center of mass of DOR and that of the protein. Residue–DOR proximity was computed as the minimum heavy-atom distance between DOR and each specified RT residue; named interactions between specific atoms, such as the hydrogen bond between the Lys103 main-chain carbonyl oxygen and the DOR triazolinone nitrogen, were measured as the distance between those two atoms directly.</w:t>
       </w:r>
     </w:p>
     <w:p>
@@ -2182,6 +2179,7 @@
         </w:rPr>
       </w:pPr>
       <w:r>
+        <w:lastRenderedPageBreak/>
         <w:t>For each replicate trajectory, MM/GBSA energy components were computed from snapshots of the explicit-solvent simulations without the water molecules.</w:t>
       </w:r>
       <w:r>
@@ -2203,11 +2201,7 @@
         <w:fldChar w:fldCharType="end"/>
       </w:r>
       <w:r>
-        <w:t xml:space="preserve"> The analysis used the same </w:t>
-      </w:r>
-      <w:r>
-        <w:lastRenderedPageBreak/>
-        <w:t>molecular-mechanics parameters as the production simulations. We evaluated complex, receptor (RT), and ligand (DOR) energies separately,</w:t>
+        <w:t xml:space="preserve"> The analysis used the same molecular-mechanics parameters as the production simulations. We evaluated complex, receptor (RT), and ligand (DOR) energies separately,</w:t>
       </w:r>
     </w:p>
     <w:p>
@@ -2735,7 +2729,11 @@
         <w:fldChar w:fldCharType="end"/>
       </w:r>
       <w:r>
-        <w:t xml:space="preserve"> Minimization relieves steric strain that single-point evaluation of frames sampled under explicit solvent, periodic boundary conditions and constrained bond lengths would otherwise carry into the cutoff-free, unconstrained implicit-solvent Hamiltonian used for scoring, where it contributes Lennard-Jones energies far larger than the binding signal. We minimized with all atoms free rather than restraining heavy atoms. Because this choice can reduce energetic noise and shift individual components, we report the sensitivity of </w:t>
+        <w:t xml:space="preserve"> Minimization relieves steric strain that single-point evaluation of frames sampled under explicit solvent, periodic boundary conditions and constrained bond lengths would otherwise carry into the cutoff-free, unconstrained implicit-solvent Hamiltonian used for scoring, where it contributes Lennard-Jones energies far larger than the binding signal. We minimized with all atoms free rather than restraining </w:t>
+      </w:r>
+      <w:r>
+        <w:lastRenderedPageBreak/>
+        <w:t xml:space="preserve">heavy atoms. Because this choice can reduce energetic noise and shift individual components, we report the sensitivity of </w:t>
       </w:r>
       <w:proofErr w:type="spellStart"/>
       <w:r>
@@ -2749,14 +2747,7 @@
       </w:r>
       <w:proofErr w:type="spellEnd"/>
       <w:r>
-        <w:t xml:space="preserve"> and of each component to it, recomputing a subset of genotypes </w:t>
-      </w:r>
-      <w:r>
-        <w:lastRenderedPageBreak/>
-        <w:t xml:space="preserve">under single-point evaluation and under hydrogen-only relaxation with heavy atoms restrained (Supplementary Note 4 and Supplementary Table 5).</w:t>
-      </w:r>
-      <w:r>
-        <w:t xml:space="preserve"> It bears on the MM/GBSA column only: ΔΔGbind, which carries the principal claim, is an alchemical free energy and involves no snapshot minimization.</w:t>
+        <w:t xml:space="preserve"> and of each component to it, recomputing a subset of genotypes under single-point evaluation and under hydrogen-only relaxation with heavy atoms restrained (Supplementary Note 4 and Supplementary Table 5). It bears on the MM/GBSA column only: ΔΔGbind, which carries the principal claim, is an alchemical free energy and involves no snapshot minimization.</w:t>
       </w:r>
     </w:p>
     <w:p>
@@ -4352,7 +4343,10 @@
         <w:t xml:space="preserve"> Each replicate was seeded from the corresponding equilibrated MD starting structure.</w:t>
       </w:r>
       <w:r>
-        <w:t xml:space="preserve">Titratable residues were assigned once in the prepared wild-type structure and carried unchanged through mutation modeling, so no titratable residue differs between the end states of any leg. All thirteen histidines are neutral with the proton on Nδ1, in the wild type and in all 18 genotypes. The glutamate introduced by G190E is deprotonated and singly charged, which is what makes that leg charge-changing. In the hybrid topologies, bonded parameters are interpolated linearly in λ and dummy atoms are relaxed during the end-state minimization. Soft-core parameters were α = 0.3, σ = 0.25 nm and a soft-core power of 1, applied to both Lennard-Jones and Coulomb interactions.</w:t>
+        <w:t xml:space="preserve"> </w:t>
+      </w:r>
+      <w:r>
+        <w:t>Titratable residues were assigned once in the prepared wild-type structure and carried unchanged through mutation modeling, so no titratable residue differs between the end states of any leg. All thirteen histidines are neutral with the proton on Nδ1, in the wild type and in all 18 genotypes. The glutamate introduced by G190E is deprotonated and singly charged, which is what makes that leg charge-changing. In the hybrid topologies, bonded parameters are interpolated linearly in λ and dummy atoms are relaxed during the end-state minimization. Soft-core parameters were α = 0.3, σ = 0.25 nm and a soft-core power of 1, applied to both Lennard-Jones and Coulomb interactions.</w:t>
       </w:r>
     </w:p>
     <w:p>
@@ -4432,11 +4426,7 @@
       </w:r>
       <w:proofErr w:type="spellEnd"/>
       <w:r>
-        <w:t xml:space="preserve">; each seeded </w:t>
-      </w:r>
-      <w:r>
-        <w:lastRenderedPageBreak/>
-        <w:t>an independent simulation in which λ was driven linearly to the opposite end state, giving 100 forward and 100 reverse work values per phase per replicate. The work accumulated along each switch is</w:t>
+        <w:t>; each seeded an independent simulation in which λ was driven linearly to the opposite end state, giving 100 forward and 100 reverse work values per phase per replicate. The work accumulated along each switch is</w:t>
       </w:r>
     </w:p>
     <w:p>
@@ -4585,6 +4575,7 @@
         <w:pStyle w:val="TAMainText"/>
       </w:pPr>
       <w:r>
+        <w:lastRenderedPageBreak/>
         <w:t xml:space="preserve">Switching times were 100 </w:t>
       </w:r>
       <w:proofErr w:type="spellStart"/>
@@ -4604,21 +4595,8 @@
         <w:t xml:space="preserve"> for legs with widely separated forward and reverse work distributions (e.g. charge-changing WT→K103N leg inherited by the K103N-containing genotypes); control runs on neutral legs gave ∆G values invariant to switching time.</w:t>
       </w:r>
       <w:r>
-        <w:t xml:space="preserve"> The two charge-changing legs, WT→K103N and WT→G190E, alter the net charge of the simulation box by one unit and therefore incur a finite-size artifact under lattice-sum electrostatics. We corrected each charged leg for the periodicity self-energy term of the Rocklin scheme [[CITE: Rocklin, Mobley, Dill, Hunenberger - binding free energies of charged species]] computed from the box dimensions and the solvent dielectric constant of TIP3P. The remaining higher-order terms of that scheme, the net-charge </w:t>
-      </w:r>
-      <w:proofErr w:type="spellStart"/>
-      <w:r>
-        <w:t>undersolvation</w:t>
-      </w:r>
-      <w:proofErr w:type="spellEnd"/>
-      <w:r>
-        <w:t xml:space="preserve"> and discrete-solvent corrections, were not applied, since computing them exactly requires a Poisson-Boltzmann pass over each environment. Their effect on ΔΔGbind is nonetheless bounded by cancellation: every finite-size term depends on the net charge, the box, the solvent density and the solute excluded volume, the charge change is identical in the holo and apo phases by construction, and the two cells are matched to within 0.13% (K103N) and 0.31% (G190E) in volume, with DOR occupying 0.019% of the cell. Taking a per-phase correction of 1 kcal/mol, roughly 25 times the leading term we compute, the residual on ΔΔGbind is at most 0.003 kcal/mol, two to three orders of magnitude below the per-leg statistical uncertainties in Table 2.</w:t>
-      </w:r>
-    </w:p>
-    <w:p>
-      <w:pPr>
-        <w:pStyle w:val="TAMainText"/>
-      </w:pPr>
+        <w:t xml:space="preserve"> </w:t>
+      </w:r>
       <w:r>
         <w:t>Because the switches are of finite duration, W exceeds ∆G on average, and the free energy must be recovered from the distribution of work values. Jarzynski’s equality</w:t>
       </w:r>
@@ -5137,7 +5115,7 @@
         <w:fldChar w:fldCharType="begin"/>
       </w:r>
       <w:r>
-        <w:instrText xml:space="preserve"> ADDIN ZOTERO_ITEM CSL_CITATION {"citationID":"xyDqDfup","properties":{"unsorted":false,"formattedCitation":"\\super 55\\nosupersub{}","plainCitation":"55","noteIndex":0},"citationItems":[{"id":289,"uris":["http://zotero.org/users/19404620/items/DLL2VZVI"],"itemData":{"id":289,"type":"article-journal","abstract":"Near-optimal strategies are developed for estimating the free energy difference between two canonical ensembles, given a Metropolis-type Monte Carlo program for sampling each one. The estimation strategy depends on the extent of overlap between the two ensembles, on the smoothness of the density-of-states as a function of the difference potential, and on the relative Monte Carlo sampling costs, per statistically independent data point. The best estimate of the free energy difference is usually obtained by dividing the available computer time approximately equally between the two ensembles; its efficiency (variance x computer time)-1 is never less, and may be several orders of magnitude greater, than that obtained by sampling only one ensemble, as is done in perturbation theory.","container-title":"Journal of Computational Physics","DOI":"10.1016/0021-9991(76)90078-4","ISSN":"0021-9991","issue":"2","journalAbbreviation":"Journal of Computational Physics","page":"245-268","source":"ScienceDirect","title":"Efficient estimation of free energy differences from Monte Carlo data","volume":"22","author":[{"family":"Bennett","given":"Charles H"}],"issued":{"date-parts":[["1976",10,1]]}}}],"schema":"https://github.com/citation-style-language/schema/raw/master/csl-citation.json"} </w:instrText>
+        <w:instrText xml:space="preserve"> ADDIN ZOTERO_ITEM CSL_CITATION {"citationID":"xyDqDfup","properties":{"unsorted":false,"formattedCitation":"\\super 56\\nosupersub{}","plainCitation":"56","noteIndex":0},"citationItems":[{"id":289,"uris":["http://zotero.org/users/19404620/items/DLL2VZVI"],"itemData":{"id":289,"type":"article-journal","abstract":"Near-optimal strategies are developed for estimating the free energy difference between two canonical ensembles, given a Metropolis-type Monte Carlo program for sampling each one. The estimation strategy depends on the extent of overlap between the two ensembles, on the smoothness of the density-of-states as a function of the difference potential, and on the relative Monte Carlo sampling costs, per statistically independent data point. The best estimate of the free energy difference is usually obtained by dividing the available computer time approximately equally between the two ensembles; its efficiency (variance x computer time)-1 is never less, and may be several orders of magnitude greater, than that obtained by sampling only one ensemble, as is done in perturbation theory.","container-title":"Journal of Computational Physics","DOI":"10.1016/0021-9991(76)90078-4","ISSN":"0021-9991","issue":"2","journalAbbreviation":"Journal of Computational Physics","page":"245-268","source":"ScienceDirect","title":"Efficient estimation of free energy differences from Monte Carlo data","volume":"22","author":[{"family":"Bennett","given":"Charles H"}],"issued":{"date-parts":[["1976",10,1]]}}}],"schema":"https://github.com/citation-style-language/schema/raw/master/csl-citation.json"} </w:instrText>
       </w:r>
       <w:r>
         <w:fldChar w:fldCharType="separate"/>
@@ -5149,7 +5127,7 @@
           <w:vertAlign w:val="superscript"/>
           <w:lang w:bidi="hi-IN"/>
         </w:rPr>
-        <w:t>55</w:t>
+        <w:t>56</w:t>
       </w:r>
       <w:r>
         <w:fldChar w:fldCharType="end"/>
@@ -5653,7 +5631,7 @@
         <w:fldChar w:fldCharType="begin"/>
       </w:r>
       <w:r>
-        <w:instrText xml:space="preserve"> ADDIN ZOTERO_ITEM CSL_CITATION {"citationID":"32E8oipi","properties":{"unsorted":false,"formattedCitation":"\\super 56\\nosupersub{}","plainCitation":"56","noteIndex":0},"citationItems":[{"id":291,"uris":["http://zotero.org/users/19404620/items/AM8GLI8P"],"itemData":{"id":291,"type":"article-journal","abstract":"The calculation of a protein-ligand binding free energy based on molecular dynamics (MD) simulations generally relies on a thermodynamic cycle in which the ligand is alchemically inserted into the system, both in the solvated protein and free in solution. The corresponding ligand-insertion free energies are typically calculated in nanoscale computational boxes simulated under periodic boundary conditions and considering electrostatic interactions defined by a periodic lattice-sum. This is distinct from the ideal bulk situation of a system of macroscopic size simulated under non-periodic boundary conditions with Coulombic electrostatic interactions. This discrepancy results in finite-size effects, which affect primarily the charging component of the insertion free energy, are dependent on the box size, and can be large when the ligand bears a net charge, especially if the protein is charged as well. This article investigates finite-size effects on calculated charging free energies using as a test case the binding of the ligand 2-amino-5-methylthiazole (net charge +1 e) to a mutant form of yeast cytochrome c peroxidase in water. Considering different charge isoforms of the protein (net charges −5, 0, +3, or +9 e), either in the absence or the presence of neutralizing counter-ions, and sizes of the cubic computational box (edges ranging from 7.42 to 11.02 nm), the potentially large magnitude of finite-size effects on the raw charging free energies (up to 17.1 kJ mol−1) is demonstrated. Two correction schemes are then proposed to eliminate these effects, a numerical and an analytical one. Both schemes are based on a continuum-electrostatics analysis and require performing Poisson-Boltzmann (PB) calculations on the protein-ligand system. While the numerical scheme requires PB calculations under both non-periodic and periodic boundary conditions, the latter at the box size considered in the MD simulations, the analytical scheme only requires three non-periodic PB calculations for a given system, its dependence on the box size being analytical. The latter scheme also provides insight into the physical origin of the finite-size effects. These two schemes also encompass a correction for discrete solvent effects that persists even in the limit of infinite box sizes. Application of either scheme essentially eliminates the size dependence of the corrected charging free energies (maximal deviation of 1.5 kJ mol−1). Because it is simple to apply, the analytical correction scheme offers a general solution to the problem of finite-size effects in free-energy calculations involving charged solutes, as encountered in calculations concerning, e.g., protein-ligand binding, biomolecular association, residue mutation, pKa and redox potential estimation, substrate transformation, solvation, and solvent-solvent partitioning.","container-title":"The Journal of Chemical Physics","DOI":"10.1063/1.4826261","ISSN":"0021-9606","issue":"18","journalAbbreviation":"J. Chem. Phys.","page":"184103","source":"Silverchair","title":"Calculating the binding free energies of charged species based on explicit-solvent simulations employing lattice-sum methods: An accurate correction scheme for electrostatic finite-size effects","title-short":"Calculating the binding free energies of charged species based on explicit-solvent simulations employing lattice-sum methods","volume":"139","author":[{"family":"Rocklin","given":"Gabriel J."},{"family":"Mobley","given":"David L."},{"family":"Dill","given":"Ken A."},{"family":"H</w:instrText>
+        <w:instrText xml:space="preserve"> ADDIN ZOTERO_ITEM CSL_CITATION {"citationID":"32E8oipi","properties":{"unsorted":false,"formattedCitation":"\\super 55\\nosupersub{}","plainCitation":"55","noteIndex":0},"citationItems":[{"id":291,"uris":["http://zotero.org/users/19404620/items/AM8GLI8P"],"itemData":{"id":291,"type":"article-journal","abstract":"The calculation of a protein-ligand binding free energy based on molecular dynamics (MD) simulations generally relies on a thermodynamic cycle in which the ligand is alchemically inserted into the system, both in the solvated protein and free in solution. The corresponding ligand-insertion free energies are typically calculated in nanoscale computational boxes simulated under periodic boundary conditions and considering electrostatic interactions defined by a periodic lattice-sum. This is distinct from the ideal bulk situation of a system of macroscopic size simulated under non-periodic boundary conditions with Coulombic electrostatic interactions. This discrepancy results in finite-size effects, which affect primarily the charging component of the insertion free energy, are dependent on the box size, and can be large when the ligand bears a net charge, especially if the protein is charged as well. This article investigates finite-size effects on calculated charging free energies using as a test case the binding of the ligand 2-amino-5-methylthiazole (net charge +1 e) to a mutant form of yeast cytochrome c peroxidase in water. Considering different charge isoforms of the protein (net charges −5, 0, +3, or +9 e), either in the absence or the presence of neutralizing counter-ions, and sizes of the cubic computational box (edges ranging from 7.42 to 11.02 nm), the potentially large magnitude of finite-size effects on the raw charging free energies (up to 17.1 kJ mol−1) is demonstrated. Two correction schemes are then proposed to eliminate these effects, a numerical and an analytical one. Both schemes are based on a continuum-electrostatics analysis and require performing Poisson-Boltzmann (PB) calculations on the protein-ligand system. While the numerical scheme requires PB calculations under both non-periodic and periodic boundary conditions, the latter at the box size considered in the MD simulations, the analytical scheme only requires three non-periodic PB calculations for a given system, its dependence on the box size being analytical. The latter scheme also provides insight into the physical origin of the finite-size effects. These two schemes also encompass a correction for discrete solvent effects that persists even in the limit of infinite box sizes. Application of either scheme essentially eliminates the size dependence of the corrected charging free energies (maximal deviation of 1.5 kJ mol−1). Because it is simple to apply, the analytical correction scheme offers a general solution to the problem of finite-size effects in free-energy calculations involving charged solutes, as encountered in calculations concerning, e.g., protein-ligand binding, biomolecular association, residue mutation, pKa and redox potential estimation, substrate transformation, solvation, and solvent-solvent partitioning.","container-title":"The Journal of Chemical Physics","DOI":"10.1063/1.4826261","ISSN":"0021-9606","issue":"18","journalAbbreviation":"J. Chem. Phys.","page":"184103","source":"Silverchair","title":"Calculating the binding free energies of charged species based on explicit-solvent simulations employing lattice-sum methods: An accurate correction scheme for electrostatic finite-size effects","title-short":"Calculating the binding free energies of charged species based on explicit-solvent simulations employing lattice-sum methods","volume":"139","author":[{"family":"Rocklin","given":"Gabriel J."},{"family":"Mobley","given":"David L."},{"family":"Dill","given":"Ken A."},{"family":"H</w:instrText>
       </w:r>
       <w:r>
         <w:rPr>
@@ -5674,7 +5652,7 @@
           <w:vertAlign w:val="superscript"/>
           <w:lang w:bidi="hi-IN"/>
         </w:rPr>
-        <w:t>56</w:t>
+        <w:t>55</w:t>
       </w:r>
       <w:r>
         <w:fldChar w:fldCharType="end"/>
@@ -5700,7 +5678,16 @@
         <w:t>apo</w:t>
       </w:r>
       <w:r>
-        <w:t xml:space="preserve"> box volumes differ by less than 1%, this correction cancels to below 10⁻³ kcal/mol in ∆∆G.</w:t>
+        <w:t xml:space="preserve"> box volumes differ by less than 1%, this correction cancels to below 10⁻³ kcal/mol in ∆∆G</w:t>
+      </w:r>
+      <w:r>
+        <w:t xml:space="preserve"> </w:t>
+      </w:r>
+      <w:r>
+        <w:t>(Supplementary Note 1)</w:t>
+      </w:r>
+      <w:r>
+        <w:t>.</w:t>
       </w:r>
     </w:p>
     <w:p>
@@ -5717,6 +5704,7 @@
           <w:bCs/>
           <w:u w:val="single"/>
         </w:rPr>
+        <w:lastRenderedPageBreak/>
         <w:t>Statistical analysis</w:t>
       </w:r>
     </w:p>
@@ -5734,14 +5722,34 @@
       </w:r>
       <w:proofErr w:type="spellEnd"/>
       <w:r>
-        <w:t xml:space="preserve">). Given the small size of the panel, these statistics are reported as descriptive </w:t>
-      </w:r>
-      <w:r>
-        <w:lastRenderedPageBreak/>
-        <w:t>effect sizes rather than as hypothesis tests, and no correction for multiple comparisons was applied.</w:t>
-      </w:r>
-      <w:r>
-        <w:t xml:space="preserve"> Agreement with phenotype was additionally summarized as a binary classification. A genotype was scored as predicted-resistant when the computed quantity, less its standard error over replicates, exceeded +0.5 kcal/mol, approximately kBT at 300 K, and as predicted-susceptible otherwise. This cutoff was fixed a priori from the thermal energy rather than fitted to the panel, and requiring the estimate to clear it by a full standard error is the same rule applied throughout the Results. Against the 13 genotypes with an established susceptible or resistant phenotype, ΔΔGbind gives 7 true positives, 3 true negatives, 1 false positive (V106I) and 2 false negatives (A98G+F227C and K103N+M230L), for a sensitivity of 0.78, a specificity of 0.75 and a Matthews correlation coefficient of 0.50. Because any single cutoff is arbitrary for an uncalibrated physical observable, we also report the threshold-free area under the ROC curve, 0.78 (exact permutation p = 0.074), which measures only whether the method ranks resistant above susceptible genotypes.</w:t>
+        <w:t>). Given the small size of the panel, these statistics are reported as descriptive effect sizes rather than as hypothesis tests, and no correction for multiple comparisons was applied.</w:t>
+      </w:r>
+      <w:r>
+        <w:t xml:space="preserve"> Agreement with phenotype was additionally summarized as a binary classification. A genotype was scored as predicted-resistant when the computed quantity, </w:t>
+      </w:r>
+      <w:r>
+        <w:t>minus</w:t>
+      </w:r>
+      <w:r>
+        <w:t xml:space="preserve"> its standard error over replicates, exceeded +0.5 kcal/mol, approximately k</w:t>
+      </w:r>
+      <w:r>
+        <w:rPr>
+          <w:vertAlign w:val="subscript"/>
+        </w:rPr>
+        <w:t>B</w:t>
+      </w:r>
+      <w:r>
+        <w:t>T at 300 K, and as predicted-susceptible otherwise. This cutoff was fixed a priori from the thermal energy rather than fitted to the panel.</w:t>
+      </w:r>
+    </w:p>
+    <w:p>
+      <w:pPr>
+        <w:pStyle w:val="TAMainText"/>
+        <w:spacing w:after="240"/>
+      </w:pPr>
+      <w:r>
+        <w:t xml:space="preserve">Convergence diagnostics. For a series of N successive frames of a structural observable, with values xt and mean x̄, sampled at interval Δt, the normalised autocorrelation function was computed as C(τ) = Σt (xt − x̄)(xt+τ − x̄) / Σt (xt − x̄)², taken over t = 1 … N−τ in the numerator and t = 1 … N in the denominator, so that C(0) = 1; lags are reported as τΔt in nanoseconds. For block averaging, each series was partitioned into M = ⌊N/n⌋ non-overlapping blocks of length n with block means x̄b = n−1 Σ xt over the n frames of block b. The standard error of the mean implied by that block length is SEM(n) = [ Σb (x̄b − x̄)² / (M(M − 1)) ]^(1/2), and the statistical inefficiency is g(n) = [SEM(n) / SEM(1)]², where SEM(1) = s/√N is the naive estimate that assumes independent frames and s is the sample standard deviation. The effective number of independent samples is Neff = N/g. Block lengths were specified in nanoseconds and converted to a frame count separately for each replicate, because replicates were not all written at the same frame rate; block means were pooled across the three replicates of a genotype, so that a 50 ns block yields six blocks from three 100 ns trajectories. Since g is the square of a ratio of estimated standard deviations, the interval shown on it is the chi-square interval on M − 1 degrees of freedom. These diagnostics are reported in Supplementary Figure 1.</w:t>
       </w:r>
     </w:p>
     <w:p>
@@ -5844,11 +5852,7 @@
         <w:t>Resistant phenotype</w:t>
       </w:r>
       <w:r>
-        <w:t xml:space="preserve">: canonical DOR-associated resistance mutations and mutation patterns, consistently associated with reduced susceptibility. These were chosen to be </w:t>
-      </w:r>
-      <w:r>
-        <w:lastRenderedPageBreak/>
-        <w:t>K103N+M230L, V106A, Y188L, Y318F, A98G+F227C, V106A+F227L, V106A+L234I, V106A+P225H, and V106I+F227C.</w:t>
+        <w:t>: canonical DOR-associated resistance mutations and mutation patterns, consistently associated with reduced susceptibility. These were chosen to be K103N+M230L, V106A, Y188L, Y318F, A98G+F227C, V106A+F227L, V106A+L234I, V106A+P225H, and V106I+F227C.</w:t>
       </w:r>
     </w:p>
     <w:p>
@@ -5869,6 +5873,7 @@
           <w:i/>
           <w:iCs/>
         </w:rPr>
+        <w:lastRenderedPageBreak/>
         <w:t>Uncertain phenotype</w:t>
       </w:r>
       <w:r>
@@ -10804,11 +10809,7 @@
         <w:fldChar w:fldCharType="end"/>
       </w:r>
       <w:r>
-        <w:t xml:space="preserve"> these relatively short MD runs are unlikely to capture converged dynamics of the full RT molecule. </w:t>
-      </w:r>
-      <w:r>
-        <w:lastRenderedPageBreak/>
-        <w:t xml:space="preserve">However, DOR pose RMSD and DOR-RT center of mass distance fluctuations suggested that DOR dynamics within the NNIBP were relatively stable during the entire course of the production runs (Supplementary Figure 1). </w:t>
+        <w:t xml:space="preserve"> these relatively short MD runs are unlikely to capture converged dynamics of the full RT molecule. However, DOR pose RMSD and DOR-RT center of mass distance fluctuations suggested that DOR dynamics within the NNIBP were relatively stable during the entire course of the production runs (Supplementary Figure 1). </w:t>
       </w:r>
     </w:p>
     <w:p>
@@ -10821,6 +10822,7 @@
         </w:rPr>
       </w:pPr>
       <w:r>
+        <w:lastRenderedPageBreak/>
         <w:t xml:space="preserve">We sampled RT-DOR structures from these </w:t>
       </w:r>
       <w:r>
@@ -24007,10 +24009,31 @@
         <w:fldChar w:fldCharType="end"/>
       </w:r>
       <w:r>
-        <w:t xml:space="preserve"> Our system is a binary RT–DOR complex containing no template/primer, so a resistance mechanism acting through that interface is absent from our simulations. </w:t>
-      </w:r>
-      <w:r>
-        <w:t xml:space="preserve"> Resistance that acts through the nucleic acid is therefore outside what we measure. A change in the primer grip, in how the template is held, or in how often RT adopts a catalytically active shape would not move ΔΔGbind or ΔΔETotal, yet could still lower susceptibility in cells.</w:t>
+        <w:t xml:space="preserve"> Our system is a binary RT–DOR complex containing no template/primer, so a resistance mechanism acting through that interface is absent from our simulations</w:t>
+      </w:r>
+      <w:r>
+        <w:t xml:space="preserve"> </w:t>
+      </w:r>
+      <w:r>
+        <w:rPr>
+          <w:color w:val="EE0000"/>
+        </w:rPr>
+        <w:t>and, th</w:t>
+      </w:r>
+      <w:r>
+        <w:t>erefore</w:t>
+      </w:r>
+      <w:r>
+        <w:t>,</w:t>
+      </w:r>
+      <w:r>
+        <w:t xml:space="preserve"> outside </w:t>
+      </w:r>
+      <w:r>
+        <w:t>the scope of our measurements</w:t>
+      </w:r>
+      <w:r>
+        <w:t>. A change in the primer grip, in how the template is held, or in how often RT adopts a catalytically active shape would not move ΔΔGbind or ΔΔETotal, yet could still lower susceptibility in cells.</w:t>
       </w:r>
     </w:p>
     <w:p>
@@ -24019,10 +24042,14 @@
         <w:spacing w:after="240"/>
       </w:pPr>
       <w:r>
-        <w:t xml:space="preserve">A second limitation concerns the unliganded enzyme. The NNIBP is not an open cavity in RT on its own. DOR has to open it, and that costs free energy. Our thermodynamic cycle introduces each mutation twice, once in the DOR-bound state and once in the unliganded state. A mutation that changes the cost of opening the pocket therefore changes both legs in the same direction, and the two changes largely cancel in ΔΔGbind. We tested this with apo simulations of wild type and seven genotypes. Every unliganded pocket was smaller than its bound counterpart. The difference between the two states was larger than in wild type for all three genotypes whose ΔΔGbind misses the phenotype (Supplementary Note 3 and Supplementary Table 7). ΔΔGbind is therefore least sensitive to the mechanism these genotypes appear to use. </w:t>
-      </w:r>
-      <w:r>
-        <w:t xml:space="preserve">More generally, resistance can act through large-scale allosteric change, through the conformational equilibrium of the unliganded pocket on timescales far longer than we sample, or through effects on enzyme processivity and viral fitness, none of which are captured in these calculations. Such mechanisms are in principle accessible to hybrid QM/MM approaches,</w:t>
+        <w:t xml:space="preserve">A second limitation concerns the unliganded enzyme. The NNIBP is not an open cavity in RT on its own. DOR has to open it, and that costs free energy. Our thermodynamic cycle introduces each mutation twice, once in the DOR-bound state and once in the unliganded state. A mutation that changes the cost of opening the pocket therefore changes both legs in the same direction, and the two changes largely cancel in ΔΔGbind. We tested this with apo simulations of wild type and seven genotypes. Every unliganded pocket was smaller than its bound counterpart. The difference </w:t>
+      </w:r>
+      <w:r>
+        <w:lastRenderedPageBreak/>
+        <w:t xml:space="preserve">between the two states was larger than in wild type for all three genotypes whose ΔΔGbind misses the phenotype (Supplementary Note 3 and Supplementary Table 7). ΔΔGbind is therefore least sensitive to the mechanism these genotypes appear to use. </w:t>
+      </w:r>
+      <w:r>
+        <w:t>More generally, resistance can act through large-scale allosteric change, through the conformational equilibrium of the unliganded pocket on timescales far longer than we sample, or through effects on enzyme processivity and viral fitness, none of which are captured in these calculations. Such mechanisms are in principle accessible to hybrid QM/MM approaches,</w:t>
       </w:r>
       <w:r>
         <w:fldChar w:fldCharType="begin"/>
@@ -24253,7 +24280,7 @@
         <w:spacing w:after="240"/>
       </w:pPr>
       <w:r>
-        <w:t xml:space="preserve">DOR parameters were generated with Gasteiger partial charges, which are less accurate for drug-like molecules than AM1-BCC or RESP. The choice matters more for MM/GBSA than for the alchemical calculation. MM/GBSA evaluates an absolute interaction energy, so its electrostatic and polar solvation terms depend directly on the ligand charges. The alchemical calculation changes the protein, not the ligand. DOR is neutral and carries identical parameters at both end states of every leg, so its contribution largely cancels. We re-scored the same trajectories with AM1-BCC charges to check this. The WT-referenced ΔΔETotal moved by at most 0.81 kcal/mol and kept its sign for every genotype tested (Supplementary Note 2 and Supplementary Table 6).</w:t>
+        <w:t>DOR parameters were generated with Gasteiger partial charges, which are less accurate for drug-like molecules than AM1-BCC or RESP. The choice matters more for MM/GBSA than for the alchemical calculation. MM/GBSA evaluates an absolute interaction energy, so its electrostatic and polar solvation terms depend directly on the ligand charges. The alchemical calculation changes the protein, not the ligand. DOR is neutral and carries identical parameters at both end states of every leg, so its contribution largely cancels. We re-scored the same trajectories with AM1-BCC charges to check this. The WT-referenced ΔΔETotal moved by at most 0.81 kcal/mol and kept its sign for every genotype tested (Supplementary Note 2 and Supplementary Table 6).</w:t>
       </w:r>
     </w:p>
     <w:p>
@@ -24262,11 +24289,11 @@
         <w:spacing w:after="240"/>
       </w:pPr>
       <w:r>
-        <w:t xml:space="preserve">The sampling is a limitation of a different kind. Three 100 ns replicates are long relative to the local relaxation of the DOR pose, which converges within the first few nanoseconds, but short relative to the domain rearrangements of RT and to the conformational equilibrium of the unliganded pocket. Our replicates were seeded from the same crystallographic pose with only small coordinate perturbations, so they sample one conformational basin well rather than surveying the accessible landscape. Stable RMSD values, overlapping forward and reverse work distributions and small replicate-to-replicate errors establish convergence within that basin; they do not establish that the basin is the only relevant one. This distinction matters most for the NNIBP, which is an induced-fit pocket that does not exist in unliganded RT, because a mutation that shifts the conformational equilibrium of the apo enzyme, or the free-energy cost of opening the pocket, perturbs both legs of our thermodynamic cycle in the same direction and largely cancels. The three genotypes where ΔΔGbind misses the phenotype, K103N+M230L, A98G+F227C and G190E, are precisely those whose reported mechanisms are pre-binding or loop-mediated, which is what that cancellation would predict. We tested this directly against our apo simulations. Compared on a matched 10 ns window, the unliganded pocket is substantially collapsed relative to the bound state (42–107 Å³ against 223–284 Å³ in Table 3), and its volume differs between genotypes: relative to WT it is −49.0 Å³ for G190E, −36.6 Å³ for V106I+F227C and −28.4 Å³ for A98G+F227C, against </w:t>
+        <w:t xml:space="preserve">The sampling is a limitation of a different kind. Three 100 ns replicates are long relative to the local relaxation of the DOR pose, which converges within the first few nanoseconds, but short relative to the domain rearrangements of RT and to the conformational equilibrium of the unliganded pocket. Our replicates were seeded from the same crystallographic pose with only small coordinate perturbations, so they sample one conformational basin well rather than surveying the accessible landscape. Stable RMSD values, overlapping forward and reverse work distributions and small replicate-to-replicate errors establish convergence within that basin; they do not </w:t>
       </w:r>
       <w:r>
         <w:lastRenderedPageBreak/>
-        <w:t>+12.5 Å³ for V106A and +2.0 Å³ for K103N+M230L. Two of the three genotypes whose ΔΔGbind misses the phenotype therefore have markedly more collapsed apo pockets than WT, which is what a pre-binding mechanism would produce and what our cycle cancels. In three of the four genotypes whose apo trajectories run to 100 ns, the pocket volume changes by only 1–5 Å³ between the first 10 ns and the remaining 90 ns, so this comparison is not an artifact of the shorter reference. Across the panel the DOR heavy-atom RMSD from the crystallographic pose settles between 0.64 and 0.93 Å, wild type at 0.66 Å, so the complexes are stable but the ensembles do not visit alternative poses.</w:t>
+        <w:t>establish that the basin is the only relevant one. This distinction matters most for the NNIBP, which is an induced-fit pocket that does not exist in unliganded RT, because a mutation that shifts the conformational equilibrium of the apo enzyme, or the free-energy cost of opening the pocket, perturbs both legs of our thermodynamic cycle in the same direction and largely cancels. The three genotypes where ΔΔGbind misses the phenotype, K103N+M230L, A98G+F227C and G190E, are precisely those whose reported mechanisms are pre-binding or loop-mediated, which is what that cancellation would predict. We tested this directly against our apo simulations. Compared on a matched 10 ns window, the unliganded pocket is substantially collapsed relative to the bound state (42–107 Å³ against 223–284 Å³ in Table 3), and its volume differs between genotypes: relative to WT it is −49.0 Å³ for G190E, −36.6 Å³ for V106I+F227C and −28.4 Å³ for A98G+F227C, against +12.5 Å³ for V106A and +2.0 Å³ for K103N+M230L. Two of the three genotypes whose ΔΔGbind misses the phenotype therefore have markedly more collapsed apo pockets than WT, which is what a pre-binding mechanism would produce and what our cycle cancels. In three of the four genotypes whose apo trajectories run to 100 ns, the pocket volume changes by only 1–5 Å³ between the first 10 ns and the remaining 90 ns, so this comparison is not an artifact of the shorter reference. Across the panel the DOR heavy-atom RMSD from the crystallographic pose settles between 0.64 and 0.93 Å, wild type at 0.66 Å, so the complexes are stable but the ensembles do not visit alternative poses.</w:t>
       </w:r>
     </w:p>
     <w:p>
@@ -24325,6 +24352,7 @@
         </w:rPr>
       </w:pPr>
       <w:r>
+        <w:lastRenderedPageBreak/>
         <w:t>The Supporting Information is available free of charge at https://pubs.acs.org/doi/10.1021/acs.jcim.XXXXXXX.</w:t>
       </w:r>
     </w:p>
@@ -24377,7 +24405,6 @@
         </w:rPr>
       </w:pPr>
       <w:r>
-        <w:lastRenderedPageBreak/>
         <w:t>Supplementary Table 3: Per-replicate MM/GBSA energy components, and per-leg alchemical free energies with BAR, Crooks Gaussian intersection and Jarzynski estimates, for every genotype (XLSX)</w:t>
       </w:r>
     </w:p>
@@ -24461,6 +24488,7 @@
           <w:i/>
           <w:iCs/>
         </w:rPr>
+        <w:lastRenderedPageBreak/>
         <w:t>Corresponding Author</w:t>
       </w:r>
     </w:p>
@@ -24533,7 +24561,6 @@
           <w:i/>
           <w:iCs/>
         </w:rPr>
-        <w:lastRenderedPageBreak/>
         <w:t>Author Contributions</w:t>
       </w:r>
     </w:p>
@@ -24626,6 +24653,7 @@
           <w:b/>
           <w:bCs/>
         </w:rPr>
+        <w:lastRenderedPageBreak/>
         <w:t>ACKNOWLEDGMENTS</w:t>
       </w:r>
     </w:p>
@@ -24670,11 +24698,7 @@
         </w:rPr>
       </w:pPr>
       <w:r>
-        <w:t>ART, antiretroviral therapy; BAR, Bennett acceptance ratio; CGI, Crooks Gaussian intersection; COM, center of mass; DLV, delavirdine; DOR, doravirine; EFV, efavirenz; ETR, etravirine; FEP, free energy perturbation; MD, molecular dynamics; MM/GBSA, molecular mechanics with generalized Born and surface area solvation; NNIBP, non-nucleoside inhibitor binding pocket; NNRTI, non-nucleoside reverse transcriptase inhibitor; NVP, nevirapine; RMSD, root-mean-</w:t>
-      </w:r>
-      <w:r>
-        <w:lastRenderedPageBreak/>
-        <w:t>square deviation; RPV, rilpivirine; RT, reverse transcriptase; SEM, standard error of the mean; WT, wild type.</w:t>
+        <w:t>ART, antiretroviral therapy; BAR, Bennett acceptance ratio; CGI, Crooks Gaussian intersection; COM, center of mass; DLV, delavirdine; DOR, doravirine; EFV, efavirenz; ETR, etravirine; FEP, free energy perturbation; MD, molecular dynamics; MM/GBSA, molecular mechanics with generalized Born and surface area solvation; NNIBP, non-nucleoside inhibitor binding pocket; NNRTI, non-nucleoside reverse transcriptase inhibitor; NVP, nevirapine; RMSD, root-mean-square deviation; RPV, rilpivirine; RT, reverse transcriptase; SEM, standard error of the mean; WT, wild type.</w:t>
       </w:r>
     </w:p>
     <w:p>
@@ -24725,7 +24749,20 @@
           <w:lang w:bidi="hi-IN"/>
         </w:rPr>
         <w:tab/>
-        <w:t xml:space="preserve">Kohlstaedt, L. A.; Wang, J.; Friedman, J. M.; Rice, P. A.; Steitz, T. A. Crystal Structure at 3.5 Å Resolution of HIV-1 Reverse Transcriptase Complexed with an Inhibitor. </w:t>
+      </w:r>
+      <w:proofErr w:type="spellStart"/>
+      <w:r>
+        <w:rPr>
+          <w:lang w:bidi="hi-IN"/>
+        </w:rPr>
+        <w:t>Kohlstaedt</w:t>
+      </w:r>
+      <w:proofErr w:type="spellEnd"/>
+      <w:r>
+        <w:rPr>
+          <w:lang w:bidi="hi-IN"/>
+        </w:rPr>
+        <w:t xml:space="preserve">, L. A.; Wang, J.; Friedman, J. M.; Rice, P. A.; Steitz, T. A. Crystal Structure at 3.5 Å Resolution of HIV-1 Reverse Transcriptase Complexed with an Inhibitor. </w:t>
       </w:r>
       <w:r>
         <w:rPr>
@@ -24851,7 +24888,35 @@
           <w:lang w:bidi="hi-IN"/>
         </w:rPr>
         <w:tab/>
-        <w:t xml:space="preserve">Rodgers, D. W.; Gamblin, S. J.; Harris, B. A.; Ray, S.; Culp, J. S.; Hellmig, B.; Woolf, D. J.; Debouck, C.; Harrison, S. C. The Structure of Unliganded Reverse Transcriptase from the Human Immunodeficiency Virus Type 1. </w:t>
+        <w:t xml:space="preserve">Rodgers, D. W.; Gamblin, S. J.; Harris, B. A.; Ray, S.; Culp, J. S.; </w:t>
+      </w:r>
+      <w:proofErr w:type="spellStart"/>
+      <w:r>
+        <w:rPr>
+          <w:lang w:bidi="hi-IN"/>
+        </w:rPr>
+        <w:t>Hellmig</w:t>
+      </w:r>
+      <w:proofErr w:type="spellEnd"/>
+      <w:r>
+        <w:rPr>
+          <w:lang w:bidi="hi-IN"/>
+        </w:rPr>
+        <w:t xml:space="preserve">, B.; Woolf, D. J.; </w:t>
+      </w:r>
+      <w:proofErr w:type="spellStart"/>
+      <w:r>
+        <w:rPr>
+          <w:lang w:bidi="hi-IN"/>
+        </w:rPr>
+        <w:t>Debouck</w:t>
+      </w:r>
+      <w:proofErr w:type="spellEnd"/>
+      <w:r>
+        <w:rPr>
+          <w:lang w:bidi="hi-IN"/>
+        </w:rPr>
+        <w:t xml:space="preserve">, C.; Harrison, S. C. The Structure of Unliganded Reverse Transcriptase from the Human Immunodeficiency Virus Type 1. </w:t>
       </w:r>
       <w:r>
         <w:rPr>
@@ -24914,7 +24979,20 @@
           <w:lang w:bidi="hi-IN"/>
         </w:rPr>
         <w:tab/>
-        <w:t xml:space="preserve">Hsiou, Y.; Ding, J.; Das, K.; AD Clark, J.; Hughes, S. H.; Arnold, E. Structure of Unliganded HIV-1 Reverse Transcriptase at 2.7 å Resolution: Implications of Conformational Changes for Polymerization and Inhibition Mechanisms. </w:t>
+      </w:r>
+      <w:proofErr w:type="spellStart"/>
+      <w:r>
+        <w:rPr>
+          <w:lang w:bidi="hi-IN"/>
+        </w:rPr>
+        <w:t>Hsiou</w:t>
+      </w:r>
+      <w:proofErr w:type="spellEnd"/>
+      <w:r>
+        <w:rPr>
+          <w:lang w:bidi="hi-IN"/>
+        </w:rPr>
+        <w:t xml:space="preserve">, Y.; Ding, J.; Das, K.; AD Clark, J.; Hughes, S. H.; Arnold, E. Structure of Unliganded HIV-1 Reverse Transcriptase at 2.7 å Resolution: Implications of Conformational Changes for Polymerization and Inhibition Mechanisms. </w:t>
       </w:r>
       <w:r>
         <w:rPr>
@@ -24985,7 +25063,25 @@
           <w:iCs/>
           <w:lang w:bidi="hi-IN"/>
         </w:rPr>
-        <w:t>Cold Spring Harb Perspect Med</w:t>
+        <w:t xml:space="preserve">Cold Spring Harb </w:t>
+      </w:r>
+      <w:proofErr w:type="spellStart"/>
+      <w:r>
+        <w:rPr>
+          <w:i/>
+          <w:iCs/>
+          <w:lang w:bidi="hi-IN"/>
+        </w:rPr>
+        <w:t>Perspect</w:t>
+      </w:r>
+      <w:proofErr w:type="spellEnd"/>
+      <w:r>
+        <w:rPr>
+          <w:i/>
+          <w:iCs/>
+          <w:lang w:bidi="hi-IN"/>
+        </w:rPr>
+        <w:t xml:space="preserve"> Med</w:t>
       </w:r>
       <w:r>
         <w:rPr>
@@ -25033,6 +25129,7 @@
         <w:rPr>
           <w:lang w:bidi="hi-IN"/>
         </w:rPr>
+        <w:lastRenderedPageBreak/>
         <w:t>(6)</w:t>
       </w:r>
       <w:r>
@@ -25040,7 +25137,21 @@
           <w:lang w:bidi="hi-IN"/>
         </w:rPr>
         <w:tab/>
-        <w:t xml:space="preserve">Cilento, M. E.; Kirby, K. A.; Sarafianos, S. G. Avoiding Drug Resistance in HIV Reverse Transcriptase. </w:t>
+        <w:t xml:space="preserve">Cilento, M. E.; Kirby, K. A.; </w:t>
+      </w:r>
+      <w:proofErr w:type="spellStart"/>
+      <w:r>
+        <w:rPr>
+          <w:lang w:bidi="hi-IN"/>
+        </w:rPr>
+        <w:t>Sarafianos</w:t>
+      </w:r>
+      <w:proofErr w:type="spellEnd"/>
+      <w:r>
+        <w:rPr>
+          <w:lang w:bidi="hi-IN"/>
+        </w:rPr>
+        <w:t xml:space="preserve">, S. G. Avoiding Drug Resistance in HIV Reverse Transcriptase. </w:t>
       </w:r>
       <w:r>
         <w:rPr>
@@ -25229,7 +25340,34 @@
           <w:lang w:bidi="hi-IN"/>
         </w:rPr>
         <w:tab/>
-        <w:t xml:space="preserve">Hsiou, Y.; Ding, J.; Das, K.; Clark, A. D.; Boyer, P. L.; Lewi, P.; Janssen, P. A. J.; Kleim, J.-P.; Rösner, M.; Hughes, S. H.; Arnold, E. The Lys103Asn Mutation of HIV-1 RT: A Novel Mechanism of Drug Resistance. </w:t>
+      </w:r>
+      <w:proofErr w:type="spellStart"/>
+      <w:r>
+        <w:rPr>
+          <w:lang w:bidi="hi-IN"/>
+        </w:rPr>
+        <w:t>Hsiou</w:t>
+      </w:r>
+      <w:proofErr w:type="spellEnd"/>
+      <w:r>
+        <w:rPr>
+          <w:lang w:bidi="hi-IN"/>
+        </w:rPr>
+        <w:t xml:space="preserve">, Y.; Ding, J.; Das, K.; Clark, A. D.; Boyer, P. L.; Lewi, P.; Janssen, P. A. J.; Kleim, J.-P.; </w:t>
+      </w:r>
+      <w:proofErr w:type="spellStart"/>
+      <w:r>
+        <w:rPr>
+          <w:lang w:bidi="hi-IN"/>
+        </w:rPr>
+        <w:t>Rösner</w:t>
+      </w:r>
+      <w:proofErr w:type="spellEnd"/>
+      <w:r>
+        <w:rPr>
+          <w:lang w:bidi="hi-IN"/>
+        </w:rPr>
+        <w:t xml:space="preserve">, M.; Hughes, S. H.; Arnold, E. The Lys103Asn Mutation of HIV-1 RT: A Novel Mechanism of Drug Resistance. </w:t>
       </w:r>
       <w:r>
         <w:rPr>
@@ -25285,7 +25423,6 @@
         <w:rPr>
           <w:lang w:bidi="hi-IN"/>
         </w:rPr>
-        <w:lastRenderedPageBreak/>
         <w:t>(10)</w:t>
       </w:r>
       <w:r>
@@ -25419,7 +25556,49 @@
           <w:lang w:bidi="hi-IN"/>
         </w:rPr>
         <w:tab/>
-        <w:t xml:space="preserve">Das, K.; Clark, Arthur D.; Lewi, P. J.; Heeres, J.; de Jonge, M. R.; Koymans, L. M. H.; Vinkers, H. M.; Daeyaert, F.; Ludovici, D. W.; Kukla, M. J.; De Corte, B.; Kavash, R. W.; Ho, C. Y.; Ye, H.; Lichtenstein, Mark. A.; Andries, K.; Pauwels, R.; de Béthune, M.-P.; Boyer, P. L.; Clark, P.; Hughes, S. H.; Janssen, P. A. J.; Arnold, E. Roles of Conformational and Positional Adaptability in Structure-Based Design of TMC125-R165335 (Etravirine) and Related Non-Nucleoside Reverse Transcriptase Inhibitors That Are Highly Potent and Effective against Wild-Type and Drug-Resistant HIV-1 Variants. </w:t>
+        <w:t xml:space="preserve">Das, K.; Clark, Arthur D.; Lewi, P. J.; Heeres, J.; de Jonge, M. R.; </w:t>
+      </w:r>
+      <w:proofErr w:type="spellStart"/>
+      <w:r>
+        <w:rPr>
+          <w:lang w:bidi="hi-IN"/>
+        </w:rPr>
+        <w:t>Koymans</w:t>
+      </w:r>
+      <w:proofErr w:type="spellEnd"/>
+      <w:r>
+        <w:rPr>
+          <w:lang w:bidi="hi-IN"/>
+        </w:rPr>
+        <w:t xml:space="preserve">, L. M. H.; </w:t>
+      </w:r>
+      <w:proofErr w:type="spellStart"/>
+      <w:r>
+        <w:rPr>
+          <w:lang w:bidi="hi-IN"/>
+        </w:rPr>
+        <w:t>Vinkers</w:t>
+      </w:r>
+      <w:proofErr w:type="spellEnd"/>
+      <w:r>
+        <w:rPr>
+          <w:lang w:bidi="hi-IN"/>
+        </w:rPr>
+        <w:t xml:space="preserve">, H. M.; </w:t>
+      </w:r>
+      <w:proofErr w:type="spellStart"/>
+      <w:r>
+        <w:rPr>
+          <w:lang w:bidi="hi-IN"/>
+        </w:rPr>
+        <w:t>Daeyaert</w:t>
+      </w:r>
+      <w:proofErr w:type="spellEnd"/>
+      <w:r>
+        <w:rPr>
+          <w:lang w:bidi="hi-IN"/>
+        </w:rPr>
+        <w:t xml:space="preserve">, F.; Ludovici, D. W.; Kukla, M. J.; De Corte, B.; Kavash, R. W.; Ho, C. Y.; Ye, H.; Lichtenstein, Mark. A.; Andries, K.; Pauwels, R.; de Béthune, M.-P.; Boyer, P. L.; Clark, P.; Hughes, S. H.; Janssen, P. A. J.; Arnold, E. Roles of Conformational and Positional Adaptability in Structure-Based Design of TMC125-R165335 (Etravirine) and Related Non-Nucleoside Reverse Transcriptase Inhibitors That Are Highly Potent and Effective against Wild-Type and Drug-Resistant HIV-1 Variants. </w:t>
       </w:r>
       <w:r>
         <w:rPr>
@@ -25545,7 +25724,98 @@
           <w:lang w:bidi="hi-IN"/>
         </w:rPr>
         <w:tab/>
-        <w:t xml:space="preserve">Côté, B.; Burch, J. D.; Asante-Appiah, E.; Bayly, C.; Bédard, L.; Blouin, M.; Campeau, L.-C.; Cauchon, E.; Chan, M.; Chefson, A.; Coulombe, N.; Cromlish, W.; Debnath, S.; Deschênes, D.; Dupont-Gaudet, K.; Falgueyret, J.-P.; Forget, R.; Gagné, S.; Gauvreau, D.; Girardin, M.; Guiral, S.; Langlois, E.; Li, C. S.; Nguyen, N.; Papp, R.; Plamondon, S.; Roy, A.; Roy, S.; Seliniotakis, R.; St-Onge, M.; Ouellet, S.; Tawa, P.; Truchon, J.-F.; Vacca, J.; Wrona, M.; Yan, Y.; Ducharme, Y. Discovery of MK-1439, an Orally Bioavailable Non-Nucleoside Reverse Transcriptase Inhibitor Potent against a Wide Range of Resistant Mutant HIV Viruses. </w:t>
+        <w:t xml:space="preserve">Côté, B.; Burch, J. D.; Asante-Appiah, E.; Bayly, C.; Bédard, L.; Blouin, M.; Campeau, L.-C.; Cauchon, E.; Chan, M.; </w:t>
+      </w:r>
+      <w:proofErr w:type="spellStart"/>
+      <w:r>
+        <w:rPr>
+          <w:lang w:bidi="hi-IN"/>
+        </w:rPr>
+        <w:t>Chefson</w:t>
+      </w:r>
+      <w:proofErr w:type="spellEnd"/>
+      <w:r>
+        <w:rPr>
+          <w:lang w:bidi="hi-IN"/>
+        </w:rPr>
+        <w:t xml:space="preserve">, A.; Coulombe, N.; </w:t>
+      </w:r>
+      <w:proofErr w:type="spellStart"/>
+      <w:r>
+        <w:rPr>
+          <w:lang w:bidi="hi-IN"/>
+        </w:rPr>
+        <w:t>Cromlish</w:t>
+      </w:r>
+      <w:proofErr w:type="spellEnd"/>
+      <w:r>
+        <w:rPr>
+          <w:lang w:bidi="hi-IN"/>
+        </w:rPr>
+        <w:t xml:space="preserve">, W.; Debnath, S.; </w:t>
+      </w:r>
+      <w:proofErr w:type="spellStart"/>
+      <w:r>
+        <w:rPr>
+          <w:lang w:bidi="hi-IN"/>
+        </w:rPr>
+        <w:t>Deschênes</w:t>
+      </w:r>
+      <w:proofErr w:type="spellEnd"/>
+      <w:r>
+        <w:rPr>
+          <w:lang w:bidi="hi-IN"/>
+        </w:rPr>
+        <w:t xml:space="preserve">, D.; Dupont-Gaudet, K.; </w:t>
+      </w:r>
+      <w:proofErr w:type="spellStart"/>
+      <w:r>
+        <w:rPr>
+          <w:lang w:bidi="hi-IN"/>
+        </w:rPr>
+        <w:t>Falgueyret</w:t>
+      </w:r>
+      <w:proofErr w:type="spellEnd"/>
+      <w:r>
+        <w:rPr>
+          <w:lang w:bidi="hi-IN"/>
+        </w:rPr>
+        <w:t xml:space="preserve">, J.-P.; Forget, R.; </w:t>
+      </w:r>
+      <w:proofErr w:type="spellStart"/>
+      <w:r>
+        <w:rPr>
+          <w:lang w:bidi="hi-IN"/>
+        </w:rPr>
+        <w:t>Gagné</w:t>
+      </w:r>
+      <w:proofErr w:type="spellEnd"/>
+      <w:r>
+        <w:rPr>
+          <w:lang w:bidi="hi-IN"/>
+        </w:rPr>
+        <w:t xml:space="preserve">, S.; Gauvreau, D.; </w:t>
+      </w:r>
+      <w:r>
+        <w:rPr>
+          <w:lang w:bidi="hi-IN"/>
+        </w:rPr>
+        <w:lastRenderedPageBreak/>
+        <w:t xml:space="preserve">Girardin, M.; Guiral, S.; Langlois, E.; Li, C. S.; Nguyen, N.; Papp, R.; Plamondon, S.; Roy, A.; Roy, S.; </w:t>
+      </w:r>
+      <w:proofErr w:type="spellStart"/>
+      <w:r>
+        <w:rPr>
+          <w:lang w:bidi="hi-IN"/>
+        </w:rPr>
+        <w:t>Seliniotakis</w:t>
+      </w:r>
+      <w:proofErr w:type="spellEnd"/>
+      <w:r>
+        <w:rPr>
+          <w:lang w:bidi="hi-IN"/>
+        </w:rPr>
+        <w:t xml:space="preserve">, R.; St-Onge, M.; Ouellet, S.; Tawa, P.; Truchon, J.-F.; Vacca, J.; Wrona, M.; Yan, Y.; Ducharme, Y. Discovery of MK-1439, an Orally Bioavailable Non-Nucleoside Reverse Transcriptase Inhibitor Potent against a Wide Range of Resistant Mutant HIV Viruses. </w:t>
       </w:r>
       <w:r>
         <w:rPr>
@@ -25734,14 +26004,21 @@
           <w:lang w:bidi="hi-IN"/>
         </w:rPr>
         <w:tab/>
-        <w:t>Lai, M.-T.; Feng, M.; Falgueyret, J.-P.; Tawa, P.; Witmer, M.; DiStefano, D.; Li, Y.; Burch, J.; Sachs, N.; Lu, M.; Cauchon, E.; Campeau, L.-C.; Grobler, J.; Yan, Y.; Ducharme, Y.; Côté, B.; Asante-Appiah, E.; Hazuda, D. J.; Miller, M. D. In Vitro Characterization of MK-</w:t>
-      </w:r>
-      <w:r>
-        <w:rPr>
-          <w:lang w:bidi="hi-IN"/>
-        </w:rPr>
-        <w:lastRenderedPageBreak/>
-        <w:t xml:space="preserve">1439, a Novel HIV-1 Nonnucleoside Reverse Transcriptase Inhibitor. </w:t>
+        <w:t xml:space="preserve">Lai, M.-T.; Feng, M.; </w:t>
+      </w:r>
+      <w:proofErr w:type="spellStart"/>
+      <w:r>
+        <w:rPr>
+          <w:lang w:bidi="hi-IN"/>
+        </w:rPr>
+        <w:t>Falgueyret</w:t>
+      </w:r>
+      <w:proofErr w:type="spellEnd"/>
+      <w:r>
+        <w:rPr>
+          <w:lang w:bidi="hi-IN"/>
+        </w:rPr>
+        <w:t xml:space="preserve">, J.-P.; Tawa, P.; Witmer, M.; DiStefano, D.; Li, Y.; Burch, J.; Sachs, N.; Lu, M.; Cauchon, E.; Campeau, L.-C.; Grobler, J.; Yan, Y.; Ducharme, Y.; Côté, B.; Asante-Appiah, E.; Hazuda, D. J.; Miller, M. D. In Vitro Characterization of MK-1439, a Novel HIV-1 Nonnucleoside Reverse Transcriptase Inhibitor. </w:t>
       </w:r>
       <w:r>
         <w:rPr>
@@ -25804,7 +26081,21 @@
           <w:lang w:bidi="hi-IN"/>
         </w:rPr>
         <w:tab/>
-        <w:t xml:space="preserve">Rhee, S.-Y.; Schapiro, J. M.; Saladini, F.; Zazzi, M.; Khoo, S.; Shafer, R. W. Potential Role of Doravirine for the Treatment of HIV-1-Infected Persons with Transmitted Drug Resistance. </w:t>
+        <w:t xml:space="preserve">Rhee, S.-Y.; Schapiro, J. M.; </w:t>
+      </w:r>
+      <w:proofErr w:type="spellStart"/>
+      <w:r>
+        <w:rPr>
+          <w:lang w:bidi="hi-IN"/>
+        </w:rPr>
+        <w:t>Saladini</w:t>
+      </w:r>
+      <w:proofErr w:type="spellEnd"/>
+      <w:r>
+        <w:rPr>
+          <w:lang w:bidi="hi-IN"/>
+        </w:rPr>
+        <w:t xml:space="preserve">, F.; Zazzi, M.; Khoo, S.; Shafer, R. W. Potential Role of Doravirine for the Treatment of HIV-1-Infected Persons with Transmitted Drug Resistance. </w:t>
       </w:r>
       <w:r>
         <w:rPr>
@@ -25867,7 +26158,49 @@
           <w:lang w:bidi="hi-IN"/>
         </w:rPr>
         <w:tab/>
-        <w:t xml:space="preserve">Calza, L.; Colangeli, V.; Pensalfine, G.; Appolloni, L.; Vitale, S.; Bon, I.; Viale, P. Doravirine/Lamivudine/Tenofovir Disoproxil Fumarate in Virologically Suppressed People Living with HIV: A Real-Life Experience. </w:t>
+        <w:t xml:space="preserve">Calza, L.; </w:t>
+      </w:r>
+      <w:proofErr w:type="spellStart"/>
+      <w:r>
+        <w:rPr>
+          <w:lang w:bidi="hi-IN"/>
+        </w:rPr>
+        <w:t>Colangeli</w:t>
+      </w:r>
+      <w:proofErr w:type="spellEnd"/>
+      <w:r>
+        <w:rPr>
+          <w:lang w:bidi="hi-IN"/>
+        </w:rPr>
+        <w:t xml:space="preserve">, V.; </w:t>
+      </w:r>
+      <w:proofErr w:type="spellStart"/>
+      <w:r>
+        <w:rPr>
+          <w:lang w:bidi="hi-IN"/>
+        </w:rPr>
+        <w:t>Pensalfine</w:t>
+      </w:r>
+      <w:proofErr w:type="spellEnd"/>
+      <w:r>
+        <w:rPr>
+          <w:lang w:bidi="hi-IN"/>
+        </w:rPr>
+        <w:t xml:space="preserve">, G.; </w:t>
+      </w:r>
+      <w:proofErr w:type="spellStart"/>
+      <w:r>
+        <w:rPr>
+          <w:lang w:bidi="hi-IN"/>
+        </w:rPr>
+        <w:t>Appolloni</w:t>
+      </w:r>
+      <w:proofErr w:type="spellEnd"/>
+      <w:r>
+        <w:rPr>
+          <w:lang w:bidi="hi-IN"/>
+        </w:rPr>
+        <w:t xml:space="preserve">, L.; Vitale, S.; Bon, I.; Viale, P. Doravirine/Lamivudine/Tenofovir Disoproxil Fumarate in Virologically Suppressed People Living with HIV: A Real-Life Experience. </w:t>
       </w:r>
       <w:r>
         <w:rPr>
@@ -25930,7 +26263,20 @@
           <w:lang w:bidi="hi-IN"/>
         </w:rPr>
         <w:tab/>
-        <w:t xml:space="preserve">Mejías-Trueba, M.; Gutierrez-Valencia, A.; Llaves-Flores, S.; Roca-Oporto, C.; Herrero, M.; Sotomayor de la Piedra, C.; Lopez-Cortes, L. F.; Espinosa, N. Long-Term Effectiveness, Safety, and Tolerability of Doravirine in Antiretroviral-Experienced People with HIV in Real Life. </w:t>
+      </w:r>
+      <w:proofErr w:type="spellStart"/>
+      <w:r>
+        <w:rPr>
+          <w:lang w:bidi="hi-IN"/>
+        </w:rPr>
+        <w:t>Mejías</w:t>
+      </w:r>
+      <w:proofErr w:type="spellEnd"/>
+      <w:r>
+        <w:rPr>
+          <w:lang w:bidi="hi-IN"/>
+        </w:rPr>
+        <w:t xml:space="preserve">-Trueba, M.; Gutierrez-Valencia, A.; Llaves-Flores, S.; Roca-Oporto, C.; Herrero, M.; Sotomayor de la Piedra, C.; Lopez-Cortes, L. F.; Espinosa, N. Long-Term Effectiveness, Safety, and Tolerability of Doravirine in Antiretroviral-Experienced People with HIV in Real Life. </w:t>
       </w:r>
       <w:r>
         <w:rPr>
@@ -26056,7 +26402,105 @@
           <w:lang w:bidi="hi-IN"/>
         </w:rPr>
         <w:tab/>
-        <w:t xml:space="preserve">Orkin, C.; Mngqibisa, R.; Velez, J. D.; Kumar, P.; Braun, D. L.; Carr, A.; Bloch, M.; Walmsley, S.; Tebas, P.; Yokomaku, Y.; Diamond, T. L.; Jackson, B.; Eves, K.; Grandhi, A.; Fuszard, M.; Klopfer, S. O.; Stamm, L. M.; Fox, M. C.; Kim, J. Switch to Fixed-Dose Doravirine (100 Mg) and Islatravir (0·25 Mg) Once Daily in Virologically Suppressed Adults with HIV-1 on Oral Antiretroviral Therapy: 48-Week Results of a Phase 3, Multicentre, Randomised, Open-Label, Non-Inferiority Trial. </w:t>
+        <w:t xml:space="preserve">Orkin, C.; </w:t>
+      </w:r>
+      <w:proofErr w:type="spellStart"/>
+      <w:r>
+        <w:rPr>
+          <w:lang w:bidi="hi-IN"/>
+        </w:rPr>
+        <w:t>Mngqibisa</w:t>
+      </w:r>
+      <w:proofErr w:type="spellEnd"/>
+      <w:r>
+        <w:rPr>
+          <w:lang w:bidi="hi-IN"/>
+        </w:rPr>
+        <w:t xml:space="preserve">, R.; Velez, J. D.; Kumar, P.; Braun, D. L.; Carr, A.; Bloch, M.; Walmsley, S.; </w:t>
+      </w:r>
+      <w:proofErr w:type="spellStart"/>
+      <w:r>
+        <w:rPr>
+          <w:lang w:bidi="hi-IN"/>
+        </w:rPr>
+        <w:t>Tebas</w:t>
+      </w:r>
+      <w:proofErr w:type="spellEnd"/>
+      <w:r>
+        <w:rPr>
+          <w:lang w:bidi="hi-IN"/>
+        </w:rPr>
+        <w:t xml:space="preserve">, P.; </w:t>
+      </w:r>
+      <w:proofErr w:type="spellStart"/>
+      <w:r>
+        <w:rPr>
+          <w:lang w:bidi="hi-IN"/>
+        </w:rPr>
+        <w:t>Yokomaku</w:t>
+      </w:r>
+      <w:proofErr w:type="spellEnd"/>
+      <w:r>
+        <w:rPr>
+          <w:lang w:bidi="hi-IN"/>
+        </w:rPr>
+        <w:t xml:space="preserve">, Y.; Diamond, T. L.; Jackson, B.; Eves, K.; Grandhi, A.; </w:t>
+      </w:r>
+      <w:proofErr w:type="spellStart"/>
+      <w:r>
+        <w:rPr>
+          <w:lang w:bidi="hi-IN"/>
+        </w:rPr>
+        <w:t>Fuszard</w:t>
+      </w:r>
+      <w:proofErr w:type="spellEnd"/>
+      <w:r>
+        <w:rPr>
+          <w:lang w:bidi="hi-IN"/>
+        </w:rPr>
+        <w:t xml:space="preserve">, M.; Klopfer, S. O.; Stamm, L. M.; Fox, M. C.; Kim, J. Switch to Fixed-Dose Doravirine (100 Mg) and </w:t>
+      </w:r>
+      <w:proofErr w:type="spellStart"/>
+      <w:r>
+        <w:rPr>
+          <w:lang w:bidi="hi-IN"/>
+        </w:rPr>
+        <w:t>Islatravir</w:t>
+      </w:r>
+      <w:proofErr w:type="spellEnd"/>
+      <w:r>
+        <w:rPr>
+          <w:lang w:bidi="hi-IN"/>
+        </w:rPr>
+        <w:t xml:space="preserve"> (0·25 Mg) Once Daily in Virologically Suppressed Adults with HIV-1 on Oral Antiretroviral Therapy: 48-Week Results of a Phase 3, </w:t>
+      </w:r>
+      <w:proofErr w:type="spellStart"/>
+      <w:r>
+        <w:rPr>
+          <w:lang w:bidi="hi-IN"/>
+        </w:rPr>
+        <w:t>Multicentre</w:t>
+      </w:r>
+      <w:proofErr w:type="spellEnd"/>
+      <w:r>
+        <w:rPr>
+          <w:lang w:bidi="hi-IN"/>
+        </w:rPr>
+        <w:t xml:space="preserve">, </w:t>
+      </w:r>
+      <w:proofErr w:type="spellStart"/>
+      <w:r>
+        <w:rPr>
+          <w:lang w:bidi="hi-IN"/>
+        </w:rPr>
+        <w:t>Randomised</w:t>
+      </w:r>
+      <w:proofErr w:type="spellEnd"/>
+      <w:r>
+        <w:rPr>
+          <w:lang w:bidi="hi-IN"/>
+        </w:rPr>
+        <w:t xml:space="preserve">, Open-Label, Non-Inferiority Trial. </w:t>
       </w:r>
       <w:r>
         <w:rPr>
@@ -26112,6 +26556,7 @@
         <w:rPr>
           <w:lang w:bidi="hi-IN"/>
         </w:rPr>
+        <w:lastRenderedPageBreak/>
         <w:t>(23)</w:t>
       </w:r>
       <w:r>
@@ -26119,7 +26564,21 @@
           <w:lang w:bidi="hi-IN"/>
         </w:rPr>
         <w:tab/>
-        <w:t xml:space="preserve">Rizzo, R. C.; Wang, D.-P.; Tirado-Rives, J.; Jorgensen, W. L. Validation of a Model for the Complex of HIV-1 Reverse Transcriptase with Sustiva through Computation of Resistance Profiles. </w:t>
+        <w:t xml:space="preserve">Rizzo, R. C.; Wang, D.-P.; Tirado-Rives, J.; Jorgensen, W. L. Validation of a Model for the Complex of HIV-1 Reverse Transcriptase with </w:t>
+      </w:r>
+      <w:proofErr w:type="spellStart"/>
+      <w:r>
+        <w:rPr>
+          <w:lang w:bidi="hi-IN"/>
+        </w:rPr>
+        <w:t>Sustiva</w:t>
+      </w:r>
+      <w:proofErr w:type="spellEnd"/>
+      <w:r>
+        <w:rPr>
+          <w:lang w:bidi="hi-IN"/>
+        </w:rPr>
+        <w:t xml:space="preserve"> through Computation of Resistance Profiles. </w:t>
       </w:r>
       <w:r>
         <w:rPr>
@@ -26245,7 +26704,20 @@
           <w:lang w:bidi="hi-IN"/>
         </w:rPr>
         <w:tab/>
-        <w:t xml:space="preserve">Udier-Blagović, M.; Tirado-Rives, J.; Jorgensen, W. L. Validation of a Model for the Complex of HIV-1 Reverse Transcriptase with Nonnucleoside Inhibitor TMC125. </w:t>
+      </w:r>
+      <w:proofErr w:type="spellStart"/>
+      <w:r>
+        <w:rPr>
+          <w:lang w:bidi="hi-IN"/>
+        </w:rPr>
+        <w:t>Udier-Blagović</w:t>
+      </w:r>
+      <w:proofErr w:type="spellEnd"/>
+      <w:r>
+        <w:rPr>
+          <w:lang w:bidi="hi-IN"/>
+        </w:rPr>
+        <w:t xml:space="preserve">, M.; Tirado-Rives, J.; Jorgensen, W. L. Validation of a Model for the Complex of HIV-1 Reverse Transcriptase with Nonnucleoside Inhibitor TMC125. </w:t>
       </w:r>
       <w:r>
         <w:rPr>
@@ -26308,7 +26780,20 @@
           <w:lang w:bidi="hi-IN"/>
         </w:rPr>
         <w:tab/>
-        <w:t xml:space="preserve">Udier-Blagović, M.; Tirado-Rives, J.; Jorgensen, W. L. Structural and Energetic Analyses of the Effects of the K103N Mutation of HIV-1 Reverse Transcriptase on Efavirenz Analogues. </w:t>
+      </w:r>
+      <w:proofErr w:type="spellStart"/>
+      <w:r>
+        <w:rPr>
+          <w:lang w:bidi="hi-IN"/>
+        </w:rPr>
+        <w:t>Udier-Blagović</w:t>
+      </w:r>
+      <w:proofErr w:type="spellEnd"/>
+      <w:r>
+        <w:rPr>
+          <w:lang w:bidi="hi-IN"/>
+        </w:rPr>
+        <w:t xml:space="preserve">, M.; Tirado-Rives, J.; Jorgensen, W. L. Structural and Energetic Analyses of the Effects of the K103N Mutation of HIV-1 Reverse Transcriptase on Efavirenz Analogues. </w:t>
       </w:r>
       <w:r>
         <w:rPr>
@@ -26364,7 +26849,6 @@
         <w:rPr>
           <w:lang w:bidi="hi-IN"/>
         </w:rPr>
-        <w:lastRenderedPageBreak/>
         <w:t>(27)</w:t>
       </w:r>
       <w:r>
@@ -26435,7 +26919,21 @@
           <w:lang w:bidi="hi-IN"/>
         </w:rPr>
         <w:tab/>
-        <w:t xml:space="preserve">Zhou, Z.; Madrid, M.; Evanseck, J. D.; Madura, J. D. Effect of a Bound Non-Nucleoside RT Inhibitor on the Dynamics of Wild-Type and Mutant HIV-1 Reverse Transcriptase. </w:t>
+        <w:t xml:space="preserve">Zhou, Z.; Madrid, M.; </w:t>
+      </w:r>
+      <w:proofErr w:type="spellStart"/>
+      <w:r>
+        <w:rPr>
+          <w:lang w:bidi="hi-IN"/>
+        </w:rPr>
+        <w:t>Evanseck</w:t>
+      </w:r>
+      <w:proofErr w:type="spellEnd"/>
+      <w:r>
+        <w:rPr>
+          <w:lang w:bidi="hi-IN"/>
+        </w:rPr>
+        <w:t xml:space="preserve">, J. D.; Madura, J. D. Effect of a Bound Non-Nucleoside RT Inhibitor on the Dynamics of Wild-Type and Mutant HIV-1 Reverse Transcriptase. </w:t>
       </w:r>
       <w:r>
         <w:rPr>
@@ -26561,7 +27059,21 @@
           <w:lang w:bidi="hi-IN"/>
         </w:rPr>
         <w:tab/>
-        <w:t xml:space="preserve">Geitmann, M.; Unge, T.; Danielson, U. H. Interaction Kinetic Characterization of HIV-1 Reverse Transcriptase Non-Nucleoside Inhibitor Resistance. </w:t>
+        <w:t xml:space="preserve">Geitmann, M.; </w:t>
+      </w:r>
+      <w:proofErr w:type="spellStart"/>
+      <w:r>
+        <w:rPr>
+          <w:lang w:bidi="hi-IN"/>
+        </w:rPr>
+        <w:t>Unge</w:t>
+      </w:r>
+      <w:proofErr w:type="spellEnd"/>
+      <w:r>
+        <w:rPr>
+          <w:lang w:bidi="hi-IN"/>
+        </w:rPr>
+        <w:t xml:space="preserve">, T.; Danielson, U. H. Interaction Kinetic Characterization of HIV-1 Reverse Transcriptase Non-Nucleoside Inhibitor Resistance. </w:t>
       </w:r>
       <w:r>
         <w:rPr>
@@ -26624,7 +27136,20 @@
           <w:lang w:bidi="hi-IN"/>
         </w:rPr>
         <w:tab/>
-        <w:t xml:space="preserve">Ghidini, A.; Serra, E.; Cavalli, A. On Free Energy Calculations in Drug Discovery. </w:t>
+      </w:r>
+      <w:proofErr w:type="spellStart"/>
+      <w:r>
+        <w:rPr>
+          <w:lang w:bidi="hi-IN"/>
+        </w:rPr>
+        <w:t>Ghidini</w:t>
+      </w:r>
+      <w:proofErr w:type="spellEnd"/>
+      <w:r>
+        <w:rPr>
+          <w:lang w:bidi="hi-IN"/>
+        </w:rPr>
+        <w:t xml:space="preserve">, A.; Serra, E.; Cavalli, A. On Free Energy Calculations in Drug Discovery. </w:t>
       </w:r>
       <w:r>
         <w:rPr>
@@ -26687,7 +27212,62 @@
           <w:lang w:bidi="hi-IN"/>
         </w:rPr>
         <w:tab/>
-        <w:t xml:space="preserve">Gapsys, V.; Pérez-Benito, L.; Aldeghi, M.; Seeliger, D.; van Vlijmen, H.; Tresadern, G.; de Groot, B. L. Large Scale Relative Protein Ligand Binding Affinities Using Non-Equilibrium Alchemy. </w:t>
+      </w:r>
+      <w:proofErr w:type="spellStart"/>
+      <w:r>
+        <w:rPr>
+          <w:lang w:bidi="hi-IN"/>
+        </w:rPr>
+        <w:t>Gapsys</w:t>
+      </w:r>
+      <w:proofErr w:type="spellEnd"/>
+      <w:r>
+        <w:rPr>
+          <w:lang w:bidi="hi-IN"/>
+        </w:rPr>
+        <w:t xml:space="preserve">, V.; Pérez-Benito, L.; </w:t>
+      </w:r>
+      <w:proofErr w:type="spellStart"/>
+      <w:r>
+        <w:rPr>
+          <w:lang w:bidi="hi-IN"/>
+        </w:rPr>
+        <w:t>Aldeghi</w:t>
+      </w:r>
+      <w:proofErr w:type="spellEnd"/>
+      <w:r>
+        <w:rPr>
+          <w:lang w:bidi="hi-IN"/>
+        </w:rPr>
+        <w:t xml:space="preserve">, M.; Seeliger, D.; van </w:t>
+      </w:r>
+      <w:proofErr w:type="spellStart"/>
+      <w:r>
+        <w:rPr>
+          <w:lang w:bidi="hi-IN"/>
+        </w:rPr>
+        <w:t>Vlijmen</w:t>
+      </w:r>
+      <w:proofErr w:type="spellEnd"/>
+      <w:r>
+        <w:rPr>
+          <w:lang w:bidi="hi-IN"/>
+        </w:rPr>
+        <w:t xml:space="preserve">, H.; </w:t>
+      </w:r>
+      <w:proofErr w:type="spellStart"/>
+      <w:r>
+        <w:rPr>
+          <w:lang w:bidi="hi-IN"/>
+        </w:rPr>
+        <w:t>Tresadern</w:t>
+      </w:r>
+      <w:proofErr w:type="spellEnd"/>
+      <w:r>
+        <w:rPr>
+          <w:lang w:bidi="hi-IN"/>
+        </w:rPr>
+        <w:t xml:space="preserve">, G.; de Groot, B. L. Large Scale Relative Protein Ligand Binding Affinities Using Non-Equilibrium Alchemy. </w:t>
       </w:r>
       <w:r>
         <w:rPr>
@@ -26750,7 +27330,35 @@
           <w:lang w:bidi="hi-IN"/>
         </w:rPr>
         <w:tab/>
-        <w:t xml:space="preserve">Kollman, P. A.; Massova, I.; Reyes, C.; Kuhn, B.; Huo, S.; Chong, L.; Lee, M.; Lee, T.; Duan, Y.; Wang, W.; Donini, O.; Cieplak, P.; Srinivasan, J.; Case, D. A.; Cheatham, T. E. Calculating Structures and Free Energies of Complex Molecules: Combining Molecular Mechanics and Continuum Models. </w:t>
+        <w:t xml:space="preserve">Kollman, P. A.; </w:t>
+      </w:r>
+      <w:proofErr w:type="spellStart"/>
+      <w:r>
+        <w:rPr>
+          <w:lang w:bidi="hi-IN"/>
+        </w:rPr>
+        <w:t>Massova</w:t>
+      </w:r>
+      <w:proofErr w:type="spellEnd"/>
+      <w:r>
+        <w:rPr>
+          <w:lang w:bidi="hi-IN"/>
+        </w:rPr>
+        <w:t xml:space="preserve">, I.; Reyes, C.; Kuhn, B.; Huo, S.; Chong, L.; Lee, M.; Lee, T.; Duan, Y.; Wang, W.; Donini, O.; </w:t>
+      </w:r>
+      <w:proofErr w:type="spellStart"/>
+      <w:r>
+        <w:rPr>
+          <w:lang w:bidi="hi-IN"/>
+        </w:rPr>
+        <w:t>Cieplak</w:t>
+      </w:r>
+      <w:proofErr w:type="spellEnd"/>
+      <w:r>
+        <w:rPr>
+          <w:lang w:bidi="hi-IN"/>
+        </w:rPr>
+        <w:t xml:space="preserve">, P.; Srinivasan, J.; Case, D. A.; Cheatham, T. E. Calculating Structures and Free Energies of Complex Molecules: Combining Molecular Mechanics and Continuum Models. </w:t>
       </w:r>
       <w:r>
         <w:rPr>
@@ -26806,6 +27414,7 @@
         <w:rPr>
           <w:lang w:bidi="hi-IN"/>
         </w:rPr>
+        <w:lastRenderedPageBreak/>
         <w:t>(34)</w:t>
       </w:r>
       <w:r>
@@ -26813,7 +27422,20 @@
           <w:lang w:bidi="hi-IN"/>
         </w:rPr>
         <w:tab/>
-        <w:t xml:space="preserve">Genheden, S.; Ryde, U. The MM/PBSA and MM/GBSA Methods to Estimate Ligand-Binding Affinities. </w:t>
+      </w:r>
+      <w:proofErr w:type="spellStart"/>
+      <w:r>
+        <w:rPr>
+          <w:lang w:bidi="hi-IN"/>
+        </w:rPr>
+        <w:t>Genheden</w:t>
+      </w:r>
+      <w:proofErr w:type="spellEnd"/>
+      <w:r>
+        <w:rPr>
+          <w:lang w:bidi="hi-IN"/>
+        </w:rPr>
+        <w:t xml:space="preserve">, S.; Ryde, U. The MM/PBSA and MM/GBSA Methods to Estimate Ligand-Binding Affinities. </w:t>
       </w:r>
       <w:r>
         <w:rPr>
@@ -26876,7 +27498,20 @@
           <w:lang w:bidi="hi-IN"/>
         </w:rPr>
         <w:tab/>
-        <w:t xml:space="preserve">Kabsch, W. A Solution for the Best Rotation to Relate Two Sets of Vectors. </w:t>
+      </w:r>
+      <w:proofErr w:type="spellStart"/>
+      <w:r>
+        <w:rPr>
+          <w:lang w:bidi="hi-IN"/>
+        </w:rPr>
+        <w:t>Kabsch</w:t>
+      </w:r>
+      <w:proofErr w:type="spellEnd"/>
+      <w:r>
+        <w:rPr>
+          <w:lang w:bidi="hi-IN"/>
+        </w:rPr>
+        <w:t xml:space="preserve">, W. A Solution for the Best Rotation to Relate Two Sets of Vectors. </w:t>
       </w:r>
       <w:r>
         <w:rPr>
@@ -26884,7 +27519,25 @@
           <w:iCs/>
           <w:lang w:bidi="hi-IN"/>
         </w:rPr>
-        <w:t>Acta Crystallographica Section A</w:t>
+        <w:t xml:space="preserve">Acta </w:t>
+      </w:r>
+      <w:proofErr w:type="spellStart"/>
+      <w:r>
+        <w:rPr>
+          <w:i/>
+          <w:iCs/>
+          <w:lang w:bidi="hi-IN"/>
+        </w:rPr>
+        <w:t>Crystallographica</w:t>
+      </w:r>
+      <w:proofErr w:type="spellEnd"/>
+      <w:r>
+        <w:rPr>
+          <w:i/>
+          <w:iCs/>
+          <w:lang w:bidi="hi-IN"/>
+        </w:rPr>
+        <w:t xml:space="preserve"> Section A</w:t>
       </w:r>
       <w:r>
         <w:rPr>
@@ -26939,7 +27592,35 @@
           <w:lang w:bidi="hi-IN"/>
         </w:rPr>
         <w:tab/>
-        <w:t xml:space="preserve">Eastman, P.; Swails, J.; Chodera, J. D.; McGibbon, R. T.; Zhao, Y.; Beauchamp, K. A.; Wang, L.-P.; Simmonett, A. C.; Harrigan, M. P.; Stern, C. D.; Wiewiora, R. P.; Brooks, B. R.; Pande, V. S. OpenMM 7: Rapid Development of High Performance Algorithms for Molecular Dynamics. </w:t>
+        <w:t xml:space="preserve">Eastman, P.; Swails, J.; </w:t>
+      </w:r>
+      <w:proofErr w:type="spellStart"/>
+      <w:r>
+        <w:rPr>
+          <w:lang w:bidi="hi-IN"/>
+        </w:rPr>
+        <w:t>Chodera</w:t>
+      </w:r>
+      <w:proofErr w:type="spellEnd"/>
+      <w:r>
+        <w:rPr>
+          <w:lang w:bidi="hi-IN"/>
+        </w:rPr>
+        <w:t xml:space="preserve">, J. D.; McGibbon, R. T.; Zhao, Y.; Beauchamp, K. A.; Wang, L.-P.; Simmonett, A. C.; Harrigan, M. P.; Stern, C. D.; Wiewiora, R. P.; Brooks, B. R.; Pande, V. S. </w:t>
+      </w:r>
+      <w:proofErr w:type="spellStart"/>
+      <w:r>
+        <w:rPr>
+          <w:lang w:bidi="hi-IN"/>
+        </w:rPr>
+        <w:t>OpenMM</w:t>
+      </w:r>
+      <w:proofErr w:type="spellEnd"/>
+      <w:r>
+        <w:rPr>
+          <w:lang w:bidi="hi-IN"/>
+        </w:rPr>
+        <w:t xml:space="preserve"> 7: Rapid Development of High Performance Algorithms for Molecular Dynamics. </w:t>
       </w:r>
       <w:r>
         <w:rPr>
@@ -27002,7 +27683,21 @@
           <w:lang w:bidi="hi-IN"/>
         </w:rPr>
         <w:tab/>
-        <w:t xml:space="preserve">Maier, J. A.; Martinez, C.; Kasavajhala, K.; Wickstrom, L.; Hauser, K. E.; Simmerling, C. ff14SB: Improving the Accuracy of Protein Side Chain and Backbone Parameters from ff99SB. </w:t>
+        <w:t xml:space="preserve">Maier, J. A.; Martinez, C.; </w:t>
+      </w:r>
+      <w:proofErr w:type="spellStart"/>
+      <w:r>
+        <w:rPr>
+          <w:lang w:bidi="hi-IN"/>
+        </w:rPr>
+        <w:t>Kasavajhala</w:t>
+      </w:r>
+      <w:proofErr w:type="spellEnd"/>
+      <w:r>
+        <w:rPr>
+          <w:lang w:bidi="hi-IN"/>
+        </w:rPr>
+        <w:t xml:space="preserve">, K.; Wickstrom, L.; Hauser, K. E.; Simmerling, C. ff14SB: Improving the Accuracy of Protein Side Chain and Backbone Parameters from ff99SB. </w:t>
       </w:r>
       <w:r>
         <w:rPr>
@@ -27010,7 +27705,25 @@
           <w:iCs/>
           <w:lang w:bidi="hi-IN"/>
         </w:rPr>
-        <w:t>J. Chem. Theory Comput.</w:t>
+        <w:t xml:space="preserve">J. Chem. Theory </w:t>
+      </w:r>
+      <w:proofErr w:type="spellStart"/>
+      <w:r>
+        <w:rPr>
+          <w:i/>
+          <w:iCs/>
+          <w:lang w:bidi="hi-IN"/>
+        </w:rPr>
+        <w:t>Comput</w:t>
+      </w:r>
+      <w:proofErr w:type="spellEnd"/>
+      <w:r>
+        <w:rPr>
+          <w:i/>
+          <w:iCs/>
+          <w:lang w:bidi="hi-IN"/>
+        </w:rPr>
+        <w:t>.</w:t>
       </w:r>
       <w:r>
         <w:rPr>
@@ -27058,7 +27771,6 @@
         <w:rPr>
           <w:lang w:bidi="hi-IN"/>
         </w:rPr>
-        <w:lastRenderedPageBreak/>
         <w:t>(38)</w:t>
       </w:r>
       <w:r>
@@ -27129,7 +27841,35 @@
           <w:lang w:bidi="hi-IN"/>
         </w:rPr>
         <w:tab/>
-        <w:t xml:space="preserve">Mobley, D. L.; Bannan, C. C.; Rizzi, A.; Bayly, C. I.; Chodera, J. D.; Lim, V. T.; Lim, N. M.; Beauchamp, K. A.; Slochower, D. R.; Shirts, M. R.; Gilson, M. K.; Eastman, P. K. Escaping Atom Types in Force Fields Using Direct Chemical Perception. </w:t>
+        <w:t xml:space="preserve">Mobley, D. L.; Bannan, C. C.; Rizzi, A.; Bayly, C. I.; </w:t>
+      </w:r>
+      <w:proofErr w:type="spellStart"/>
+      <w:r>
+        <w:rPr>
+          <w:lang w:bidi="hi-IN"/>
+        </w:rPr>
+        <w:t>Chodera</w:t>
+      </w:r>
+      <w:proofErr w:type="spellEnd"/>
+      <w:r>
+        <w:rPr>
+          <w:lang w:bidi="hi-IN"/>
+        </w:rPr>
+        <w:t xml:space="preserve">, J. D.; Lim, V. T.; Lim, N. M.; Beauchamp, K. A.; </w:t>
+      </w:r>
+      <w:proofErr w:type="spellStart"/>
+      <w:r>
+        <w:rPr>
+          <w:lang w:bidi="hi-IN"/>
+        </w:rPr>
+        <w:t>Slochower</w:t>
+      </w:r>
+      <w:proofErr w:type="spellEnd"/>
+      <w:r>
+        <w:rPr>
+          <w:lang w:bidi="hi-IN"/>
+        </w:rPr>
+        <w:t xml:space="preserve">, D. R.; Shirts, M. R.; Gilson, M. K.; Eastman, P. K. Escaping Atom Types in Force Fields Using Direct Chemical Perception. </w:t>
       </w:r>
       <w:r>
         <w:rPr>
@@ -27137,7 +27877,25 @@
           <w:iCs/>
           <w:lang w:bidi="hi-IN"/>
         </w:rPr>
-        <w:t>J. Chem. Theory Comput.</w:t>
+        <w:t xml:space="preserve">J. Chem. Theory </w:t>
+      </w:r>
+      <w:proofErr w:type="spellStart"/>
+      <w:r>
+        <w:rPr>
+          <w:i/>
+          <w:iCs/>
+          <w:lang w:bidi="hi-IN"/>
+        </w:rPr>
+        <w:t>Comput</w:t>
+      </w:r>
+      <w:proofErr w:type="spellEnd"/>
+      <w:r>
+        <w:rPr>
+          <w:i/>
+          <w:iCs/>
+          <w:lang w:bidi="hi-IN"/>
+        </w:rPr>
+        <w:t>.</w:t>
       </w:r>
       <w:r>
         <w:rPr>
@@ -27255,7 +28013,14 @@
           <w:lang w:bidi="hi-IN"/>
         </w:rPr>
         <w:tab/>
-        <w:t>Darden, T.; York, D.; Pedersen, L. Particle Mesh Ewald: An N</w:t>
+        <w:t xml:space="preserve">Darden, T.; York, D.; Pedersen, L. Particle Mesh Ewald: An </w:t>
+      </w:r>
+      <w:proofErr w:type="spellStart"/>
+      <w:r>
+        <w:rPr>
+          <w:lang w:bidi="hi-IN"/>
+        </w:rPr>
+        <w:t>N</w:t>
       </w:r>
       <w:r>
         <w:rPr>
@@ -27268,7 +28033,14 @@
         <w:rPr>
           <w:lang w:bidi="hi-IN"/>
         </w:rPr>
-        <w:t xml:space="preserve">log(N) Method for Ewald Sums in Large Systems. </w:t>
+        <w:t>log</w:t>
+      </w:r>
+      <w:proofErr w:type="spellEnd"/>
+      <w:r>
+        <w:rPr>
+          <w:lang w:bidi="hi-IN"/>
+        </w:rPr>
+        <w:t xml:space="preserve">(N) Method for Ewald Sums in Large Systems. </w:t>
       </w:r>
       <w:r>
         <w:rPr>
@@ -27331,7 +28103,21 @@
           <w:lang w:bidi="hi-IN"/>
         </w:rPr>
         <w:tab/>
-        <w:t xml:space="preserve">Michaud-Agrawal, N.; Denning, E. J.; Woolf, T. B.; Beckstein, O. MDAnalysis: A Toolkit for the Analysis of Molecular Dynamics Simulations. </w:t>
+        <w:t xml:space="preserve">Michaud-Agrawal, N.; Denning, E. J.; Woolf, T. B.; Beckstein, O. </w:t>
+      </w:r>
+      <w:proofErr w:type="spellStart"/>
+      <w:r>
+        <w:rPr>
+          <w:lang w:bidi="hi-IN"/>
+        </w:rPr>
+        <w:t>MDAnalysis</w:t>
+      </w:r>
+      <w:proofErr w:type="spellEnd"/>
+      <w:r>
+        <w:rPr>
+          <w:lang w:bidi="hi-IN"/>
+        </w:rPr>
+        <w:t xml:space="preserve">: A Toolkit for the Analysis of Molecular Dynamics Simulations. </w:t>
       </w:r>
       <w:r>
         <w:rPr>
@@ -27394,7 +28180,21 @@
           <w:lang w:bidi="hi-IN"/>
         </w:rPr>
         <w:tab/>
-        <w:t xml:space="preserve">McGibbon, R. T.; Beauchamp, K. A.; Harrigan, M. P.; Klein, C.; Swails, J. M.; Hernández, C. X.; Schwantes, C. R.; Wang, L.-P.; Lane, T. J.; Pande, V. S. MDTraj: A Modern Open Library for the Analysis of Molecular Dynamics Trajectories. </w:t>
+        <w:t xml:space="preserve">McGibbon, R. T.; Beauchamp, K. A.; Harrigan, M. P.; Klein, C.; Swails, J. M.; Hernández, C. X.; Schwantes, C. R.; Wang, L.-P.; Lane, T. J.; Pande, V. S. </w:t>
+      </w:r>
+      <w:proofErr w:type="spellStart"/>
+      <w:r>
+        <w:rPr>
+          <w:lang w:bidi="hi-IN"/>
+        </w:rPr>
+        <w:t>MDTraj</w:t>
+      </w:r>
+      <w:proofErr w:type="spellEnd"/>
+      <w:r>
+        <w:rPr>
+          <w:lang w:bidi="hi-IN"/>
+        </w:rPr>
+        <w:t xml:space="preserve">: A Modern Open Library for the Analysis of Molecular Dynamics Trajectories. </w:t>
       </w:r>
       <w:r>
         <w:rPr>
@@ -27457,7 +28257,20 @@
           <w:lang w:bidi="hi-IN"/>
         </w:rPr>
         <w:tab/>
-        <w:t xml:space="preserve">Massova, I.; Kollman, P. A. Combined Molecular Mechanical and Continuum Solvent Approach (MM-PBSA/GBSA) to Predict Ligand Binding. </w:t>
+      </w:r>
+      <w:proofErr w:type="spellStart"/>
+      <w:r>
+        <w:rPr>
+          <w:lang w:bidi="hi-IN"/>
+        </w:rPr>
+        <w:t>Massova</w:t>
+      </w:r>
+      <w:proofErr w:type="spellEnd"/>
+      <w:r>
+        <w:rPr>
+          <w:lang w:bidi="hi-IN"/>
+        </w:rPr>
+        <w:t xml:space="preserve">, I.; Kollman, P. A. Combined Molecular Mechanical and Continuum Solvent Approach (MM-PBSA/GBSA) to Predict Ligand Binding. </w:t>
       </w:r>
       <w:r>
         <w:rPr>
@@ -27513,6 +28326,7 @@
         <w:rPr>
           <w:lang w:bidi="hi-IN"/>
         </w:rPr>
+        <w:lastRenderedPageBreak/>
         <w:t>(45)</w:t>
       </w:r>
       <w:r>
@@ -27520,7 +28334,20 @@
           <w:lang w:bidi="hi-IN"/>
         </w:rPr>
         <w:tab/>
-        <w:t xml:space="preserve">Onufriev, A.; Bashford, D.; Case, D. A. Exploring Protein Native States and Large-Scale Conformational Changes with a Modified Generalized Born Model. </w:t>
+      </w:r>
+      <w:proofErr w:type="spellStart"/>
+      <w:r>
+        <w:rPr>
+          <w:lang w:bidi="hi-IN"/>
+        </w:rPr>
+        <w:t>Onufriev</w:t>
+      </w:r>
+      <w:proofErr w:type="spellEnd"/>
+      <w:r>
+        <w:rPr>
+          <w:lang w:bidi="hi-IN"/>
+        </w:rPr>
+        <w:t xml:space="preserve">, A.; Bashford, D.; Case, D. A. Exploring Protein Native States and Large-Scale Conformational Changes with a Modified Generalized Born Model. </w:t>
       </w:r>
       <w:r>
         <w:rPr>
@@ -27646,7 +28473,35 @@
           <w:lang w:bidi="hi-IN"/>
         </w:rPr>
         <w:tab/>
-        <w:t xml:space="preserve">Rastelli, G.; Rio, A. D.; Degliesposti, G.; Sgobba, M. Fast and Accurate Predictions of Binding Free Energies Using MM-PBSA and MM-GBSA. </w:t>
+        <w:t xml:space="preserve">Rastelli, G.; Rio, A. D.; </w:t>
+      </w:r>
+      <w:proofErr w:type="spellStart"/>
+      <w:r>
+        <w:rPr>
+          <w:lang w:bidi="hi-IN"/>
+        </w:rPr>
+        <w:t>Degliesposti</w:t>
+      </w:r>
+      <w:proofErr w:type="spellEnd"/>
+      <w:r>
+        <w:rPr>
+          <w:lang w:bidi="hi-IN"/>
+        </w:rPr>
+        <w:t xml:space="preserve">, G.; </w:t>
+      </w:r>
+      <w:proofErr w:type="spellStart"/>
+      <w:r>
+        <w:rPr>
+          <w:lang w:bidi="hi-IN"/>
+        </w:rPr>
+        <w:t>Sgobba</w:t>
+      </w:r>
+      <w:proofErr w:type="spellEnd"/>
+      <w:r>
+        <w:rPr>
+          <w:lang w:bidi="hi-IN"/>
+        </w:rPr>
+        <w:t xml:space="preserve">, M. Fast and Accurate Predictions of Binding Free Energies Using MM-PBSA and MM-GBSA. </w:t>
       </w:r>
       <w:r>
         <w:rPr>
@@ -27709,7 +28564,35 @@
           <w:lang w:bidi="hi-IN"/>
         </w:rPr>
         <w:tab/>
-        <w:t xml:space="preserve">Weis, A.; Katebzadeh, K.; Söderhjelm, P.; Nilsson, I.; Ryde, U. Ligand Affinities Predicted with the MM/PBSA Method:  Dependence on the Simulation Method and the Force Field. </w:t>
+        <w:t xml:space="preserve">Weis, A.; </w:t>
+      </w:r>
+      <w:proofErr w:type="spellStart"/>
+      <w:r>
+        <w:rPr>
+          <w:lang w:bidi="hi-IN"/>
+        </w:rPr>
+        <w:t>Katebzadeh</w:t>
+      </w:r>
+      <w:proofErr w:type="spellEnd"/>
+      <w:r>
+        <w:rPr>
+          <w:lang w:bidi="hi-IN"/>
+        </w:rPr>
+        <w:t xml:space="preserve">, K.; </w:t>
+      </w:r>
+      <w:proofErr w:type="spellStart"/>
+      <w:r>
+        <w:rPr>
+          <w:lang w:bidi="hi-IN"/>
+        </w:rPr>
+        <w:t>Söderhjelm</w:t>
+      </w:r>
+      <w:proofErr w:type="spellEnd"/>
+      <w:r>
+        <w:rPr>
+          <w:lang w:bidi="hi-IN"/>
+        </w:rPr>
+        <w:t xml:space="preserve">, P.; Nilsson, I.; Ryde, U. Ligand Affinities Predicted with the MM/PBSA Method:  Dependence on the Simulation Method and the Force Field. </w:t>
       </w:r>
       <w:r>
         <w:rPr>
@@ -27772,7 +28655,48 @@
           <w:lang w:bidi="hi-IN"/>
         </w:rPr>
         <w:tab/>
-        <w:t xml:space="preserve">Gapsys, V.; Michielssens, S.; Seeliger, D.; de Groot, B. L. Pmx: Automated Protein Structure and Topology Generation for Alchemical Perturbations. </w:t>
+      </w:r>
+      <w:proofErr w:type="spellStart"/>
+      <w:r>
+        <w:rPr>
+          <w:lang w:bidi="hi-IN"/>
+        </w:rPr>
+        <w:t>Gapsys</w:t>
+      </w:r>
+      <w:proofErr w:type="spellEnd"/>
+      <w:r>
+        <w:rPr>
+          <w:lang w:bidi="hi-IN"/>
+        </w:rPr>
+        <w:t xml:space="preserve">, V.; </w:t>
+      </w:r>
+      <w:proofErr w:type="spellStart"/>
+      <w:r>
+        <w:rPr>
+          <w:lang w:bidi="hi-IN"/>
+        </w:rPr>
+        <w:t>Michielssens</w:t>
+      </w:r>
+      <w:proofErr w:type="spellEnd"/>
+      <w:r>
+        <w:rPr>
+          <w:lang w:bidi="hi-IN"/>
+        </w:rPr>
+        <w:t xml:space="preserve">, S.; Seeliger, D.; de Groot, B. L. </w:t>
+      </w:r>
+      <w:proofErr w:type="spellStart"/>
+      <w:r>
+        <w:rPr>
+          <w:lang w:bidi="hi-IN"/>
+        </w:rPr>
+        <w:t>Pmx</w:t>
+      </w:r>
+      <w:proofErr w:type="spellEnd"/>
+      <w:r>
+        <w:rPr>
+          <w:lang w:bidi="hi-IN"/>
+        </w:rPr>
+        <w:t xml:space="preserve">: Automated Protein Structure and Topology Generation for Alchemical Perturbations. </w:t>
       </w:r>
       <w:r>
         <w:rPr>
@@ -27828,7 +28752,6 @@
         <w:rPr>
           <w:lang w:bidi="hi-IN"/>
         </w:rPr>
-        <w:lastRenderedPageBreak/>
         <w:t>(50)</w:t>
       </w:r>
       <w:r>
@@ -27836,8 +28759,23 @@
           <w:lang w:bidi="hi-IN"/>
         </w:rPr>
         <w:tab/>
-        <w:t xml:space="preserve">Abraham, M. J.; Murtola, T.; Schulz, R.; Páll, S.; Smith, J. C.; Hess, B.; Lindahl, E. GROMACS: High Performance Molecular Simulations through Multi-Level Parallelism from Laptops to Supercomputers. </w:t>
-      </w:r>
+        <w:t xml:space="preserve">Abraham, M. J.; </w:t>
+      </w:r>
+      <w:proofErr w:type="spellStart"/>
+      <w:r>
+        <w:rPr>
+          <w:lang w:bidi="hi-IN"/>
+        </w:rPr>
+        <w:t>Murtola</w:t>
+      </w:r>
+      <w:proofErr w:type="spellEnd"/>
+      <w:r>
+        <w:rPr>
+          <w:lang w:bidi="hi-IN"/>
+        </w:rPr>
+        <w:t xml:space="preserve">, T.; Schulz, R.; Páll, S.; Smith, J. C.; Hess, B.; Lindahl, E. GROMACS: High Performance Molecular Simulations through Multi-Level Parallelism from Laptops to Supercomputers. </w:t>
+      </w:r>
+      <w:proofErr w:type="spellStart"/>
       <w:r>
         <w:rPr>
           <w:i/>
@@ -27846,6 +28784,7 @@
         </w:rPr>
         <w:t>SoftwareX</w:t>
       </w:r>
+      <w:proofErr w:type="spellEnd"/>
       <w:r>
         <w:rPr>
           <w:lang w:bidi="hi-IN"/>
@@ -27899,7 +28838,20 @@
           <w:lang w:bidi="hi-IN"/>
         </w:rPr>
         <w:tab/>
-        <w:t xml:space="preserve">Gapsys, V.; Seeliger, D.; de Groot, B. L. New Soft-Core Potential Function for Molecular Dynamics Based Alchemical Free Energy Calculations. </w:t>
+      </w:r>
+      <w:proofErr w:type="spellStart"/>
+      <w:r>
+        <w:rPr>
+          <w:lang w:bidi="hi-IN"/>
+        </w:rPr>
+        <w:t>Gapsys</w:t>
+      </w:r>
+      <w:proofErr w:type="spellEnd"/>
+      <w:r>
+        <w:rPr>
+          <w:lang w:bidi="hi-IN"/>
+        </w:rPr>
+        <w:t xml:space="preserve">, V.; Seeliger, D.; de Groot, B. L. New Soft-Core Potential Function for Molecular Dynamics Based Alchemical Free Energy Calculations. </w:t>
       </w:r>
       <w:r>
         <w:rPr>
@@ -27907,7 +28859,25 @@
           <w:iCs/>
           <w:lang w:bidi="hi-IN"/>
         </w:rPr>
-        <w:t>J. Chem. Theory Comput.</w:t>
+        <w:t xml:space="preserve">J. Chem. Theory </w:t>
+      </w:r>
+      <w:proofErr w:type="spellStart"/>
+      <w:r>
+        <w:rPr>
+          <w:i/>
+          <w:iCs/>
+          <w:lang w:bidi="hi-IN"/>
+        </w:rPr>
+        <w:t>Comput</w:t>
+      </w:r>
+      <w:proofErr w:type="spellEnd"/>
+      <w:r>
+        <w:rPr>
+          <w:i/>
+          <w:iCs/>
+          <w:lang w:bidi="hi-IN"/>
+        </w:rPr>
+        <w:t>.</w:t>
       </w:r>
       <w:r>
         <w:rPr>
@@ -28151,7 +29121,21 @@
           <w:lang w:bidi="hi-IN"/>
         </w:rPr>
         <w:tab/>
-        <w:t xml:space="preserve">Bennett, C. H. Efficient Estimation of Free Energy Differences from Monte Carlo Data. </w:t>
+        <w:t xml:space="preserve">Rocklin, G. J.; Mobley, D. L.; Dill, K. A.; </w:t>
+      </w:r>
+      <w:proofErr w:type="spellStart"/>
+      <w:r>
+        <w:rPr>
+          <w:lang w:bidi="hi-IN"/>
+        </w:rPr>
+        <w:t>Hünenberger</w:t>
+      </w:r>
+      <w:proofErr w:type="spellEnd"/>
+      <w:r>
+        <w:rPr>
+          <w:lang w:bidi="hi-IN"/>
+        </w:rPr>
+        <w:t xml:space="preserve">, P. H. Calculating the Binding Free Energies of Charged Species Based on Explicit-Solvent Simulations Employing Lattice-Sum Methods: An Accurate Correction Scheme for Electrostatic Finite-Size Effects. </w:t>
       </w:r>
       <w:r>
         <w:rPr>
@@ -28159,7 +29143,7 @@
           <w:iCs/>
           <w:lang w:bidi="hi-IN"/>
         </w:rPr>
-        <w:t>Journal of Computational Physics</w:t>
+        <w:t>J. Chem. Phys.</w:t>
       </w:r>
       <w:r>
         <w:rPr>
@@ -28173,7 +29157,7 @@
           <w:bCs/>
           <w:lang w:bidi="hi-IN"/>
         </w:rPr>
-        <w:t>1976</w:t>
+        <w:t>2013</w:t>
       </w:r>
       <w:r>
         <w:rPr>
@@ -28187,13 +29171,13 @@
           <w:iCs/>
           <w:lang w:bidi="hi-IN"/>
         </w:rPr>
-        <w:t>22</w:t>
-      </w:r>
-      <w:r>
-        <w:rPr>
-          <w:lang w:bidi="hi-IN"/>
-        </w:rPr>
-        <w:t xml:space="preserve"> (2), 245–268. https://doi.org/10.1016/0021-9991(76)90078-4</w:t>
+        <w:t>139</w:t>
+      </w:r>
+      <w:r>
+        <w:rPr>
+          <w:lang w:bidi="hi-IN"/>
+        </w:rPr>
+        <w:t xml:space="preserve"> (18), 184103. https://doi.org/10.1063/1.4826261</w:t>
       </w:r>
     </w:p>
     <w:p>
@@ -28214,7 +29198,7 @@
           <w:lang w:bidi="hi-IN"/>
         </w:rPr>
         <w:tab/>
-        <w:t xml:space="preserve">Rocklin, G. J.; Mobley, D. L.; Dill, K. A.; Hünenberger, P. H. Calculating the Binding Free Energies of Charged Species Based on Explicit-Solvent Simulations Employing Lattice-Sum Methods: An Accurate Correction Scheme for Electrostatic Finite-Size Effects. </w:t>
+        <w:t xml:space="preserve">Bennett, C. H. Efficient Estimation of Free Energy Differences from Monte Carlo Data. </w:t>
       </w:r>
       <w:r>
         <w:rPr>
@@ -28222,7 +29206,7 @@
           <w:iCs/>
           <w:lang w:bidi="hi-IN"/>
         </w:rPr>
-        <w:t>J. Chem. Phys.</w:t>
+        <w:t>Journal of Computational Physics</w:t>
       </w:r>
       <w:r>
         <w:rPr>
@@ -28236,7 +29220,7 @@
           <w:bCs/>
           <w:lang w:bidi="hi-IN"/>
         </w:rPr>
-        <w:t>2013</w:t>
+        <w:t>1976</w:t>
       </w:r>
       <w:r>
         <w:rPr>
@@ -28250,13 +29234,13 @@
           <w:iCs/>
           <w:lang w:bidi="hi-IN"/>
         </w:rPr>
-        <w:t>139</w:t>
-      </w:r>
-      <w:r>
-        <w:rPr>
-          <w:lang w:bidi="hi-IN"/>
-        </w:rPr>
-        <w:t xml:space="preserve"> (18), 184103. https://doi.org/10.1063/1.4826261</w:t>
+        <w:t>22</w:t>
+      </w:r>
+      <w:r>
+        <w:rPr>
+          <w:lang w:bidi="hi-IN"/>
+        </w:rPr>
+        <w:t xml:space="preserve"> (2), 245–268. https://doi.org/10.1016/0021-9991(76)90078-4</w:t>
       </w:r>
     </w:p>
     <w:p>
@@ -28277,7 +29261,42 @@
           <w:lang w:bidi="hi-IN"/>
         </w:rPr>
         <w:tab/>
-        <w:t xml:space="preserve">Orkin, C.; Kuritzkes, D. R.; Katlama, C.; Su, F.-H.; Plank, R. M.; Lahoulou, R.; Asante-Appiah, E. Doravirine Resistance Patterns Identified Through Week 192 in the DRIVE-FORWARD and DRIVE-AHEAD Phase 3 Clinical Trials. </w:t>
+        <w:t xml:space="preserve">Orkin, C.; Kuritzkes, D. R.; </w:t>
+      </w:r>
+      <w:proofErr w:type="spellStart"/>
+      <w:r>
+        <w:rPr>
+          <w:lang w:bidi="hi-IN"/>
+        </w:rPr>
+        <w:t>Katlama</w:t>
+      </w:r>
+      <w:proofErr w:type="spellEnd"/>
+      <w:r>
+        <w:rPr>
+          <w:lang w:bidi="hi-IN"/>
+        </w:rPr>
+        <w:t xml:space="preserve">, C.; Su, F.-H.; Plank, R. M.; </w:t>
+      </w:r>
+      <w:proofErr w:type="spellStart"/>
+      <w:r>
+        <w:rPr>
+          <w:lang w:bidi="hi-IN"/>
+        </w:rPr>
+        <w:t>Lahoulou</w:t>
+      </w:r>
+      <w:proofErr w:type="spellEnd"/>
+      <w:r>
+        <w:rPr>
+          <w:lang w:bidi="hi-IN"/>
+        </w:rPr>
+        <w:t>, R.; Asante-Appiah, E. Doravirine Resistance Patterns Identified Through Week 192 in the DRIVE-</w:t>
+      </w:r>
+      <w:r>
+        <w:rPr>
+          <w:lang w:bidi="hi-IN"/>
+        </w:rPr>
+        <w:lastRenderedPageBreak/>
+        <w:t xml:space="preserve">FORWARD and DRIVE-AHEAD Phase 3 Clinical Trials. </w:t>
       </w:r>
       <w:r>
         <w:rPr>
@@ -28285,7 +29304,25 @@
           <w:iCs/>
           <w:lang w:bidi="hi-IN"/>
         </w:rPr>
-        <w:t>J Acquir Immune Defic Syndr</w:t>
+        <w:t xml:space="preserve">J </w:t>
+      </w:r>
+      <w:proofErr w:type="spellStart"/>
+      <w:r>
+        <w:rPr>
+          <w:i/>
+          <w:iCs/>
+          <w:lang w:bidi="hi-IN"/>
+        </w:rPr>
+        <w:t>Acquir</w:t>
+      </w:r>
+      <w:proofErr w:type="spellEnd"/>
+      <w:r>
+        <w:rPr>
+          <w:i/>
+          <w:iCs/>
+          <w:lang w:bidi="hi-IN"/>
+        </w:rPr>
+        <w:t xml:space="preserve"> Immune Defic Syndr</w:t>
       </w:r>
       <w:r>
         <w:rPr>
@@ -28466,7 +29503,6 @@
         <w:rPr>
           <w:lang w:bidi="hi-IN"/>
         </w:rPr>
-        <w:lastRenderedPageBreak/>
         <w:t>(61)</w:t>
       </w:r>
       <w:r>
@@ -28608,7 +29644,25 @@
           <w:iCs/>
           <w:lang w:bidi="hi-IN"/>
         </w:rPr>
-        <w:t>J. Chem. Theory Comput.</w:t>
+        <w:t xml:space="preserve">J. Chem. Theory </w:t>
+      </w:r>
+      <w:proofErr w:type="spellStart"/>
+      <w:r>
+        <w:rPr>
+          <w:i/>
+          <w:iCs/>
+          <w:lang w:bidi="hi-IN"/>
+        </w:rPr>
+        <w:t>Comput</w:t>
+      </w:r>
+      <w:proofErr w:type="spellEnd"/>
+      <w:r>
+        <w:rPr>
+          <w:i/>
+          <w:iCs/>
+          <w:lang w:bidi="hi-IN"/>
+        </w:rPr>
+        <w:t>.</w:t>
       </w:r>
       <w:r>
         <w:rPr>
@@ -28663,7 +29717,49 @@
           <w:lang w:bidi="hi-IN"/>
         </w:rPr>
         <w:tab/>
-        <w:t xml:space="preserve">Ripoll, D. R.; Khavrutskii, I. V.; Chaudhury, S.; Liu, J.; Kuschner, R. A.; Wallqvist, A.; Reifman, J. Quantitative Predictions of Binding Free Energy Changes in Drug-Resistant Influenza Neuraminidase. </w:t>
+        <w:t xml:space="preserve">Ripoll, D. R.; </w:t>
+      </w:r>
+      <w:proofErr w:type="spellStart"/>
+      <w:r>
+        <w:rPr>
+          <w:lang w:bidi="hi-IN"/>
+        </w:rPr>
+        <w:t>Khavrutskii</w:t>
+      </w:r>
+      <w:proofErr w:type="spellEnd"/>
+      <w:r>
+        <w:rPr>
+          <w:lang w:bidi="hi-IN"/>
+        </w:rPr>
+        <w:t xml:space="preserve">, I. V.; Chaudhury, S.; Liu, J.; </w:t>
+      </w:r>
+      <w:proofErr w:type="spellStart"/>
+      <w:r>
+        <w:rPr>
+          <w:lang w:bidi="hi-IN"/>
+        </w:rPr>
+        <w:t>Kuschner</w:t>
+      </w:r>
+      <w:proofErr w:type="spellEnd"/>
+      <w:r>
+        <w:rPr>
+          <w:lang w:bidi="hi-IN"/>
+        </w:rPr>
+        <w:t xml:space="preserve">, R. A.; </w:t>
+      </w:r>
+      <w:proofErr w:type="spellStart"/>
+      <w:r>
+        <w:rPr>
+          <w:lang w:bidi="hi-IN"/>
+        </w:rPr>
+        <w:t>Wallqvist</w:t>
+      </w:r>
+      <w:proofErr w:type="spellEnd"/>
+      <w:r>
+        <w:rPr>
+          <w:lang w:bidi="hi-IN"/>
+        </w:rPr>
+        <w:t xml:space="preserve">, A.; Reifman, J. Quantitative Predictions of Binding Free Energy Changes in Drug-Resistant Influenza Neuraminidase. </w:t>
       </w:r>
       <w:r>
         <w:rPr>
@@ -28726,7 +29822,35 @@
           <w:lang w:bidi="hi-IN"/>
         </w:rPr>
         <w:tab/>
-        <w:t xml:space="preserve">Havranek, B.; Demissie, R.; Lee, H.; Lan, S.; Zhang, H.; Sarafianos, S.; Ayitou, A. J.-L.; Islam, S. M. Discovery of Nirmatrelvir Resistance Mutations in SARS-CoV‑2 3CLpro: A Computational-Experimental Approach. </w:t>
+        <w:t xml:space="preserve">Havranek, B.; Demissie, R.; Lee, H.; Lan, S.; Zhang, H.; </w:t>
+      </w:r>
+      <w:proofErr w:type="spellStart"/>
+      <w:r>
+        <w:rPr>
+          <w:lang w:bidi="hi-IN"/>
+        </w:rPr>
+        <w:t>Sarafianos</w:t>
+      </w:r>
+      <w:proofErr w:type="spellEnd"/>
+      <w:r>
+        <w:rPr>
+          <w:lang w:bidi="hi-IN"/>
+        </w:rPr>
+        <w:t xml:space="preserve">, S.; </w:t>
+      </w:r>
+      <w:proofErr w:type="spellStart"/>
+      <w:r>
+        <w:rPr>
+          <w:lang w:bidi="hi-IN"/>
+        </w:rPr>
+        <w:t>Ayitou</w:t>
+      </w:r>
+      <w:proofErr w:type="spellEnd"/>
+      <w:r>
+        <w:rPr>
+          <w:lang w:bidi="hi-IN"/>
+        </w:rPr>
+        <w:t xml:space="preserve">, A. J.-L.; Islam, S. M. Discovery of Nirmatrelvir Resistance Mutations in SARS-CoV‑2 3CLpro: A Computational-Experimental Approach. </w:t>
       </w:r>
       <w:r>
         <w:rPr>
@@ -28797,7 +29921,25 @@
           <w:iCs/>
           <w:lang w:bidi="hi-IN"/>
         </w:rPr>
-        <w:t>J. Chem. Theory Comput.</w:t>
+        <w:t xml:space="preserve">J. Chem. Theory </w:t>
+      </w:r>
+      <w:proofErr w:type="spellStart"/>
+      <w:r>
+        <w:rPr>
+          <w:i/>
+          <w:iCs/>
+          <w:lang w:bidi="hi-IN"/>
+        </w:rPr>
+        <w:t>Comput</w:t>
+      </w:r>
+      <w:proofErr w:type="spellEnd"/>
+      <w:r>
+        <w:rPr>
+          <w:i/>
+          <w:iCs/>
+          <w:lang w:bidi="hi-IN"/>
+        </w:rPr>
+        <w:t>.</w:t>
       </w:r>
       <w:r>
         <w:rPr>
@@ -28852,7 +29994,41 @@
           <w:lang w:bidi="hi-IN"/>
         </w:rPr>
         <w:tab/>
-        <w:t xml:space="preserve">Bastys, T.; Gapsys, V.; Doncheva, N. T.; Kaiser, R.; de Groot, B. L.; Kalinina, O. V. Consistent Prediction of Mutation Effect on Drug Binding in HIV‑1 Protease Using Alchemical Calculations. </w:t>
+      </w:r>
+      <w:proofErr w:type="spellStart"/>
+      <w:r>
+        <w:rPr>
+          <w:lang w:bidi="hi-IN"/>
+        </w:rPr>
+        <w:t>Bastys</w:t>
+      </w:r>
+      <w:proofErr w:type="spellEnd"/>
+      <w:r>
+        <w:rPr>
+          <w:lang w:bidi="hi-IN"/>
+        </w:rPr>
+        <w:t xml:space="preserve">, T.; </w:t>
+      </w:r>
+      <w:proofErr w:type="spellStart"/>
+      <w:r>
+        <w:rPr>
+          <w:lang w:bidi="hi-IN"/>
+        </w:rPr>
+        <w:t>Gapsys</w:t>
+      </w:r>
+      <w:proofErr w:type="spellEnd"/>
+      <w:r>
+        <w:rPr>
+          <w:lang w:bidi="hi-IN"/>
+        </w:rPr>
+        <w:t xml:space="preserve">, V.; Doncheva, N. T.; Kaiser, R.; de Groot, B. L.; Kalinina, O. V. Consistent Prediction of Mutation Effect on Drug Binding in HIV‑1 Protease Using </w:t>
+      </w:r>
+      <w:r>
+        <w:rPr>
+          <w:lang w:bidi="hi-IN"/>
+        </w:rPr>
+        <w:lastRenderedPageBreak/>
+        <w:t xml:space="preserve">Alchemical Calculations. </w:t>
       </w:r>
       <w:r>
         <w:rPr>
@@ -28860,7 +30036,25 @@
           <w:iCs/>
           <w:lang w:bidi="hi-IN"/>
         </w:rPr>
-        <w:t>J. Chem. Theory Comput.</w:t>
+        <w:t xml:space="preserve">J. Chem. Theory </w:t>
+      </w:r>
+      <w:proofErr w:type="spellStart"/>
+      <w:r>
+        <w:rPr>
+          <w:i/>
+          <w:iCs/>
+          <w:lang w:bidi="hi-IN"/>
+        </w:rPr>
+        <w:t>Comput</w:t>
+      </w:r>
+      <w:proofErr w:type="spellEnd"/>
+      <w:r>
+        <w:rPr>
+          <w:i/>
+          <w:iCs/>
+          <w:lang w:bidi="hi-IN"/>
+        </w:rPr>
+        <w:t>.</w:t>
       </w:r>
       <w:r>
         <w:rPr>
@@ -28915,7 +30109,48 @@
           <w:lang w:bidi="hi-IN"/>
         </w:rPr>
         <w:tab/>
-        <w:t xml:space="preserve">Bastys, T.; Gapsys, V.; Walter, H.; Heger, E.; Doncheva, N. T.; Kaiser, R.; de Groot, B. L.; Kalinina, O. V. Non-Active Site Mutants of HIV-1 Protease Influence Resistance and Sensitisation towards Protease Inhibitors. </w:t>
+      </w:r>
+      <w:proofErr w:type="spellStart"/>
+      <w:r>
+        <w:rPr>
+          <w:lang w:bidi="hi-IN"/>
+        </w:rPr>
+        <w:t>Bastys</w:t>
+      </w:r>
+      <w:proofErr w:type="spellEnd"/>
+      <w:r>
+        <w:rPr>
+          <w:lang w:bidi="hi-IN"/>
+        </w:rPr>
+        <w:t xml:space="preserve">, T.; </w:t>
+      </w:r>
+      <w:proofErr w:type="spellStart"/>
+      <w:r>
+        <w:rPr>
+          <w:lang w:bidi="hi-IN"/>
+        </w:rPr>
+        <w:t>Gapsys</w:t>
+      </w:r>
+      <w:proofErr w:type="spellEnd"/>
+      <w:r>
+        <w:rPr>
+          <w:lang w:bidi="hi-IN"/>
+        </w:rPr>
+        <w:t xml:space="preserve">, V.; Walter, H.; Heger, E.; Doncheva, N. T.; Kaiser, R.; de Groot, B. L.; Kalinina, O. V. Non-Active Site Mutants of HIV-1 Protease Influence Resistance and </w:t>
+      </w:r>
+      <w:proofErr w:type="spellStart"/>
+      <w:r>
+        <w:rPr>
+          <w:lang w:bidi="hi-IN"/>
+        </w:rPr>
+        <w:t>Sensitisation</w:t>
+      </w:r>
+      <w:proofErr w:type="spellEnd"/>
+      <w:r>
+        <w:rPr>
+          <w:lang w:bidi="hi-IN"/>
+        </w:rPr>
+        <w:t xml:space="preserve"> towards Protease Inhibitors. </w:t>
       </w:r>
       <w:r>
         <w:rPr>
@@ -28978,7 +30213,21 @@
           <w:lang w:bidi="hi-IN"/>
         </w:rPr>
         <w:tab/>
-        <w:t xml:space="preserve">Sun, Q.; Levy, R. M.; Kirby, K. A.; Wang, Z.; Sarafianos, S. G.; Deng, N. Molecular Dynamics Free Energy Simulations Reveal the Mechanism for the Antiviral Resistance of the M66I HIV-1 Capsid Mutation. </w:t>
+        <w:t xml:space="preserve">Sun, Q.; Levy, R. M.; Kirby, K. A.; Wang, Z.; </w:t>
+      </w:r>
+      <w:proofErr w:type="spellStart"/>
+      <w:r>
+        <w:rPr>
+          <w:lang w:bidi="hi-IN"/>
+        </w:rPr>
+        <w:t>Sarafianos</w:t>
+      </w:r>
+      <w:proofErr w:type="spellEnd"/>
+      <w:r>
+        <w:rPr>
+          <w:lang w:bidi="hi-IN"/>
+        </w:rPr>
+        <w:t xml:space="preserve">, S. G.; Deng, N. Molecular Dynamics Free Energy Simulations Reveal the Mechanism for the Antiviral Resistance of the M66I HIV-1 Capsid Mutation. </w:t>
       </w:r>
       <w:r>
         <w:rPr>
@@ -29041,7 +30290,35 @@
           <w:lang w:bidi="hi-IN"/>
         </w:rPr>
         <w:tab/>
-        <w:t xml:space="preserve">Li, M.; Oliveira Passos, D.; Shan, Z.; Smith, S. J.; Sun, Q.; Biswas, A.; Choudhuri, I.; Strutzenberg, T. S.; Haldane, A.; Deng, N.; Li, Z.; Zhao, X. Z.; Briganti, L.; Kvaratskhelia, M.; Burke, T. R.; Levy, R. M.; Hughes, S. H.; Craigie, R.; Lyumkis, D. Mechanisms of HIV-1 Integrase Resistance to Dolutegravir and Potent Inhibition of Drug-Resistant Variants. </w:t>
+        <w:t xml:space="preserve">Li, M.; Oliveira Passos, D.; Shan, Z.; Smith, S. J.; Sun, Q.; Biswas, A.; Choudhuri, I.; </w:t>
+      </w:r>
+      <w:proofErr w:type="spellStart"/>
+      <w:r>
+        <w:rPr>
+          <w:lang w:bidi="hi-IN"/>
+        </w:rPr>
+        <w:t>Strutzenberg</w:t>
+      </w:r>
+      <w:proofErr w:type="spellEnd"/>
+      <w:r>
+        <w:rPr>
+          <w:lang w:bidi="hi-IN"/>
+        </w:rPr>
+        <w:t xml:space="preserve">, T. S.; Haldane, A.; Deng, N.; Li, Z.; Zhao, X. Z.; Briganti, L.; Kvaratskhelia, M.; Burke, T. R.; Levy, R. M.; Hughes, S. H.; Craigie, R.; </w:t>
+      </w:r>
+      <w:proofErr w:type="spellStart"/>
+      <w:r>
+        <w:rPr>
+          <w:lang w:bidi="hi-IN"/>
+        </w:rPr>
+        <w:t>Lyumkis</w:t>
+      </w:r>
+      <w:proofErr w:type="spellEnd"/>
+      <w:r>
+        <w:rPr>
+          <w:lang w:bidi="hi-IN"/>
+        </w:rPr>
+        <w:t xml:space="preserve">, D. Mechanisms of HIV-1 Integrase Resistance to Dolutegravir and Potent Inhibition of Drug-Resistant Variants. </w:t>
       </w:r>
       <w:r>
         <w:rPr>
@@ -29097,7 +30374,6 @@
         <w:rPr>
           <w:lang w:bidi="hi-IN"/>
         </w:rPr>
-        <w:lastRenderedPageBreak/>
         <w:t>(71)</w:t>
       </w:r>
       <w:r>
@@ -29105,7 +30381,21 @@
           <w:lang w:bidi="hi-IN"/>
         </w:rPr>
         <w:tab/>
-        <w:t xml:space="preserve">Hauser, K.; Negron, C.; Albanese, S. K.; Ray, S.; Steinbrecher, T.; Abel, R.; Chodera, J. D.; Wang, L. Predicting Resistance of Clinical Abl Mutations to Targeted Kinase Inhibitors Using Alchemical Free-Energy Calculations. </w:t>
+        <w:t xml:space="preserve">Hauser, K.; Negron, C.; Albanese, S. K.; Ray, S.; Steinbrecher, T.; Abel, R.; </w:t>
+      </w:r>
+      <w:proofErr w:type="spellStart"/>
+      <w:r>
+        <w:rPr>
+          <w:lang w:bidi="hi-IN"/>
+        </w:rPr>
+        <w:t>Chodera</w:t>
+      </w:r>
+      <w:proofErr w:type="spellEnd"/>
+      <w:r>
+        <w:rPr>
+          <w:lang w:bidi="hi-IN"/>
+        </w:rPr>
+        <w:t xml:space="preserve">, J. D.; Wang, L. Predicting Resistance of Clinical Abl Mutations to Targeted Kinase Inhibitors Using Alchemical Free-Energy Calculations. </w:t>
       </w:r>
       <w:r>
         <w:rPr>
@@ -29168,7 +30458,35 @@
           <w:lang w:bidi="hi-IN"/>
         </w:rPr>
         <w:tab/>
-        <w:t xml:space="preserve">Nagarajan, A.; Amberg-Johnson, K.; Paull, E.; Huang, K.; Ghanakota, P.; Chandrasinghe, A.; Chief Elk, J.; Sampson, J. M.; Wang, L.; Abel, R.; Albanese, S. K. Predicting Resistance to Small Molecule Kinase Inhibitors. </w:t>
+        <w:t xml:space="preserve">Nagarajan, A.; Amberg-Johnson, K.; Paull, E.; Huang, K.; </w:t>
+      </w:r>
+      <w:proofErr w:type="spellStart"/>
+      <w:r>
+        <w:rPr>
+          <w:lang w:bidi="hi-IN"/>
+        </w:rPr>
+        <w:t>Ghanakota</w:t>
+      </w:r>
+      <w:proofErr w:type="spellEnd"/>
+      <w:r>
+        <w:rPr>
+          <w:lang w:bidi="hi-IN"/>
+        </w:rPr>
+        <w:t xml:space="preserve">, P.; </w:t>
+      </w:r>
+      <w:proofErr w:type="spellStart"/>
+      <w:r>
+        <w:rPr>
+          <w:lang w:bidi="hi-IN"/>
+        </w:rPr>
+        <w:t>Chandrasinghe</w:t>
+      </w:r>
+      <w:proofErr w:type="spellEnd"/>
+      <w:r>
+        <w:rPr>
+          <w:lang w:bidi="hi-IN"/>
+        </w:rPr>
+        <w:t xml:space="preserve">, A.; Chief Elk, J.; Sampson, J. M.; Wang, L.; Abel, R.; Albanese, S. K. Predicting Resistance to Small Molecule Kinase Inhibitors. </w:t>
       </w:r>
       <w:r>
         <w:rPr>
@@ -29231,7 +30549,35 @@
           <w:lang w:bidi="hi-IN"/>
         </w:rPr>
         <w:tab/>
-        <w:t xml:space="preserve">Wang, L.; Wu, Y.; Deng, Y.; Kim, B.; Pierce, L.; Krilov, G.; Lupyan, D.; Robinson, S.; Dahlgren, M. K.; Greenwood, J.; Romero, D. L.; Masse, C.; Knight, J. L.; Steinbrecher, T.; Beuming, T.; Damm, W.; Harder, E.; Sherman, W.; Brewer, M.; Wester, R.; Murcko, M.; Frye, L.; Farid, R.; Lin, T.; Mobley, D. L.; Jorgensen, W. L.; Berne, B. J.; Friesner, R. A.; Abel, R. Accurate and Reliable Prediction of Relative Ligand Binding Potency in Prospective Drug Discovery by Way of a Modern Free-Energy Calculation Protocol and Force Field. </w:t>
+        <w:t xml:space="preserve">Wang, L.; Wu, Y.; Deng, Y.; Kim, B.; Pierce, L.; Krilov, G.; </w:t>
+      </w:r>
+      <w:proofErr w:type="spellStart"/>
+      <w:r>
+        <w:rPr>
+          <w:lang w:bidi="hi-IN"/>
+        </w:rPr>
+        <w:t>Lupyan</w:t>
+      </w:r>
+      <w:proofErr w:type="spellEnd"/>
+      <w:r>
+        <w:rPr>
+          <w:lang w:bidi="hi-IN"/>
+        </w:rPr>
+        <w:t xml:space="preserve">, D.; Robinson, S.; Dahlgren, M. K.; Greenwood, J.; Romero, D. L.; Masse, C.; Knight, J. L.; Steinbrecher, T.; </w:t>
+      </w:r>
+      <w:proofErr w:type="spellStart"/>
+      <w:r>
+        <w:rPr>
+          <w:lang w:bidi="hi-IN"/>
+        </w:rPr>
+        <w:t>Beuming</w:t>
+      </w:r>
+      <w:proofErr w:type="spellEnd"/>
+      <w:r>
+        <w:rPr>
+          <w:lang w:bidi="hi-IN"/>
+        </w:rPr>
+        <w:t xml:space="preserve">, T.; Damm, W.; Harder, E.; Sherman, W.; Brewer, M.; Wester, R.; Murcko, M.; Frye, L.; Farid, R.; Lin, T.; Mobley, D. L.; Jorgensen, W. L.; Berne, B. J.; Friesner, R. A.; Abel, R. Accurate and Reliable Prediction of Relative Ligand Binding Potency in Prospective Drug Discovery by Way of a Modern Free-Energy Calculation Protocol and Force Field. </w:t>
       </w:r>
       <w:r>
         <w:rPr>
@@ -29294,7 +30640,161 @@
           <w:lang w:bidi="hi-IN"/>
         </w:rPr>
         <w:tab/>
-        <w:t xml:space="preserve">Schindler, C. E. M.; Baumann, H.; Blum, A.; Böse, D.; Buchstaller, H.-P.; Burgdorf, L.; Cappel, D.; Chekler, E.; Czodrowski, P.; Dorsch, D.; Eguida, M. K. I.; Follows, B.; Fuchß, T.; Grädler, U.; Gunera, J.; Johnson, T.; Jorand Lebrun, C.; Karra, S.; Klein, M.; Knehans, T.; Koetzner, L.; Krier, M.; Leiendecker, M.; Leuthner, B.; Li, L.; Mochalkin, I.; Musil, D.; Neagu, C.; Rippmann, F.; Schiemann, K.; Schulz, R.; Steinbrecher, T.; Tanzer, E.-M.; Unzue Lopez, A.; Viacava Follis, A.; Wegener, A.; Kuhn, D. Large-Scale Assessment of Binding Free Energy Calculations in Active Drug Discovery Projects. </w:t>
+        <w:t xml:space="preserve">Schindler, C. E. M.; Baumann, H.; Blum, A.; </w:t>
+      </w:r>
+      <w:proofErr w:type="spellStart"/>
+      <w:r>
+        <w:rPr>
+          <w:lang w:bidi="hi-IN"/>
+        </w:rPr>
+        <w:t>Böse</w:t>
+      </w:r>
+      <w:proofErr w:type="spellEnd"/>
+      <w:r>
+        <w:rPr>
+          <w:lang w:bidi="hi-IN"/>
+        </w:rPr>
+        <w:t xml:space="preserve">, D.; </w:t>
+      </w:r>
+      <w:proofErr w:type="spellStart"/>
+      <w:r>
+        <w:rPr>
+          <w:lang w:bidi="hi-IN"/>
+        </w:rPr>
+        <w:t>Buchstaller</w:t>
+      </w:r>
+      <w:proofErr w:type="spellEnd"/>
+      <w:r>
+        <w:rPr>
+          <w:lang w:bidi="hi-IN"/>
+        </w:rPr>
+        <w:t xml:space="preserve">, H.-P.; Burgdorf, L.; Cappel, D.; </w:t>
+      </w:r>
+      <w:proofErr w:type="spellStart"/>
+      <w:r>
+        <w:rPr>
+          <w:lang w:bidi="hi-IN"/>
+        </w:rPr>
+        <w:t>Chekler</w:t>
+      </w:r>
+      <w:proofErr w:type="spellEnd"/>
+      <w:r>
+        <w:rPr>
+          <w:lang w:bidi="hi-IN"/>
+        </w:rPr>
+        <w:t xml:space="preserve">, E.; </w:t>
+      </w:r>
+      <w:proofErr w:type="spellStart"/>
+      <w:r>
+        <w:rPr>
+          <w:lang w:bidi="hi-IN"/>
+        </w:rPr>
+        <w:t>Czodrowski</w:t>
+      </w:r>
+      <w:proofErr w:type="spellEnd"/>
+      <w:r>
+        <w:rPr>
+          <w:lang w:bidi="hi-IN"/>
+        </w:rPr>
+        <w:t xml:space="preserve">, P.; Dorsch, D.; </w:t>
+      </w:r>
+      <w:proofErr w:type="spellStart"/>
+      <w:r>
+        <w:rPr>
+          <w:lang w:bidi="hi-IN"/>
+        </w:rPr>
+        <w:t>Eguida</w:t>
+      </w:r>
+      <w:proofErr w:type="spellEnd"/>
+      <w:r>
+        <w:rPr>
+          <w:lang w:bidi="hi-IN"/>
+        </w:rPr>
+        <w:t xml:space="preserve">, M. K. I.; Follows, B.; </w:t>
+      </w:r>
+      <w:proofErr w:type="spellStart"/>
+      <w:r>
+        <w:rPr>
+          <w:lang w:bidi="hi-IN"/>
+        </w:rPr>
+        <w:t>Fuchß</w:t>
+      </w:r>
+      <w:proofErr w:type="spellEnd"/>
+      <w:r>
+        <w:rPr>
+          <w:lang w:bidi="hi-IN"/>
+        </w:rPr>
+        <w:t xml:space="preserve">, T.; </w:t>
+      </w:r>
+      <w:proofErr w:type="spellStart"/>
+      <w:r>
+        <w:rPr>
+          <w:lang w:bidi="hi-IN"/>
+        </w:rPr>
+        <w:t>Grädler</w:t>
+      </w:r>
+      <w:proofErr w:type="spellEnd"/>
+      <w:r>
+        <w:rPr>
+          <w:lang w:bidi="hi-IN"/>
+        </w:rPr>
+        <w:t xml:space="preserve">, U.; Gunera, J.; Johnson, T.; Jorand Lebrun, C.; Karra, S.; Klein, M.; Knehans, T.; </w:t>
+      </w:r>
+      <w:proofErr w:type="spellStart"/>
+      <w:r>
+        <w:rPr>
+          <w:lang w:bidi="hi-IN"/>
+        </w:rPr>
+        <w:t>Koetzner</w:t>
+      </w:r>
+      <w:proofErr w:type="spellEnd"/>
+      <w:r>
+        <w:rPr>
+          <w:lang w:bidi="hi-IN"/>
+        </w:rPr>
+        <w:t xml:space="preserve">, L.; Krier, M.; Leiendecker, M.; Leuthner, B.; Li, L.; </w:t>
+      </w:r>
+      <w:proofErr w:type="spellStart"/>
+      <w:r>
+        <w:rPr>
+          <w:lang w:bidi="hi-IN"/>
+        </w:rPr>
+        <w:t>Mochalkin</w:t>
+      </w:r>
+      <w:proofErr w:type="spellEnd"/>
+      <w:r>
+        <w:rPr>
+          <w:lang w:bidi="hi-IN"/>
+        </w:rPr>
+        <w:t xml:space="preserve">, I.; Musil, D.; Neagu, C.; Rippmann, F.; Schiemann, K.; Schulz, R.; Steinbrecher, T.; Tanzer, E.-M.; </w:t>
+      </w:r>
+      <w:proofErr w:type="spellStart"/>
+      <w:r>
+        <w:rPr>
+          <w:lang w:bidi="hi-IN"/>
+        </w:rPr>
+        <w:t>Unzue</w:t>
+      </w:r>
+      <w:proofErr w:type="spellEnd"/>
+      <w:r>
+        <w:rPr>
+          <w:lang w:bidi="hi-IN"/>
+        </w:rPr>
+        <w:t xml:space="preserve"> Lopez, A.; </w:t>
+      </w:r>
+      <w:proofErr w:type="spellStart"/>
+      <w:r>
+        <w:rPr>
+          <w:lang w:bidi="hi-IN"/>
+        </w:rPr>
+        <w:t>Viacava</w:t>
+      </w:r>
+      <w:proofErr w:type="spellEnd"/>
+      <w:r>
+        <w:rPr>
+          <w:lang w:bidi="hi-IN"/>
+        </w:rPr>
+        <w:t xml:space="preserve"> Follis, A.; Wegener, A.; Kuhn, D. Large-Scale Assessment of Binding Free Energy Calculations in Active Drug Discovery Projects. </w:t>
       </w:r>
       <w:r>
         <w:rPr>
@@ -29350,6 +30850,7 @@
         <w:rPr>
           <w:lang w:bidi="hi-IN"/>
         </w:rPr>
+        <w:lastRenderedPageBreak/>
         <w:t>(75)</w:t>
       </w:r>
       <w:r>
@@ -29420,7 +30921,21 @@
           <w:lang w:bidi="hi-IN"/>
         </w:rPr>
         <w:tab/>
-        <w:t xml:space="preserve">Huang, W.; Gamarnik, A.; Limoli, K.; Petropoulos, C. J.; Whitcomb, J. M. Amino Acid Substitutions at Position 190 of Human Immunodeficiency Virus Type 1 Reverse Transcriptase Increase Susceptibility to Delavirdine and Impair Virus Replication. </w:t>
+        <w:t xml:space="preserve">Huang, W.; </w:t>
+      </w:r>
+      <w:proofErr w:type="spellStart"/>
+      <w:r>
+        <w:rPr>
+          <w:lang w:bidi="hi-IN"/>
+        </w:rPr>
+        <w:t>Gamarnik</w:t>
+      </w:r>
+      <w:proofErr w:type="spellEnd"/>
+      <w:r>
+        <w:rPr>
+          <w:lang w:bidi="hi-IN"/>
+        </w:rPr>
+        <w:t xml:space="preserve">, A.; Limoli, K.; Petropoulos, C. J.; Whitcomb, J. M. Amino Acid Substitutions at Position 190 of Human Immunodeficiency Virus Type 1 Reverse Transcriptase Increase Susceptibility to Delavirdine and Impair Virus Replication. </w:t>
       </w:r>
       <w:r>
         <w:rPr>
@@ -29483,7 +30998,21 @@
           <w:lang w:bidi="hi-IN"/>
         </w:rPr>
         <w:tab/>
-        <w:t xml:space="preserve">Ren, J.; Nichols, C. E.; Chamberlain, P. P.; Weaver, K. L.; Short, S. A.; Stammers, D. K. Crystal Structures of HIV-1 Reverse Transcriptases Mutated at Codons 100, 106 and 108 and Mechanisms of Resistance to Non-Nucleoside Inhibitors. </w:t>
+        <w:t xml:space="preserve">Ren, J.; Nichols, C. E.; Chamberlain, P. P.; Weaver, K. L.; Short, S. A.; Stammers, D. K. Crystal Structures of HIV-1 Reverse </w:t>
+      </w:r>
+      <w:proofErr w:type="spellStart"/>
+      <w:r>
+        <w:rPr>
+          <w:lang w:bidi="hi-IN"/>
+        </w:rPr>
+        <w:t>Transcriptases</w:t>
+      </w:r>
+      <w:proofErr w:type="spellEnd"/>
+      <w:r>
+        <w:rPr>
+          <w:lang w:bidi="hi-IN"/>
+        </w:rPr>
+        <w:t xml:space="preserve"> Mutated at Codons 100, 106 and 108 and Mechanisms of Resistance to Non-Nucleoside Inhibitors. </w:t>
       </w:r>
       <w:r>
         <w:rPr>
@@ -29546,7 +31075,35 @@
           <w:lang w:bidi="hi-IN"/>
         </w:rPr>
         <w:tab/>
-        <w:t xml:space="preserve">Reddy, N.; Papathanasopoulos, M.; Steegen, K.; Basson, A. E. K103N, V106M and Y188L Significantly Reduce HIV-1 Subtype C Phenotypic Susceptibility to Doravirine. </w:t>
+        <w:t xml:space="preserve">Reddy, N.; </w:t>
+      </w:r>
+      <w:proofErr w:type="spellStart"/>
+      <w:r>
+        <w:rPr>
+          <w:lang w:bidi="hi-IN"/>
+        </w:rPr>
+        <w:t>Papathanasopoulos</w:t>
+      </w:r>
+      <w:proofErr w:type="spellEnd"/>
+      <w:r>
+        <w:rPr>
+          <w:lang w:bidi="hi-IN"/>
+        </w:rPr>
+        <w:t xml:space="preserve">, M.; </w:t>
+      </w:r>
+      <w:proofErr w:type="spellStart"/>
+      <w:r>
+        <w:rPr>
+          <w:lang w:bidi="hi-IN"/>
+        </w:rPr>
+        <w:t>Steegen</w:t>
+      </w:r>
+      <w:proofErr w:type="spellEnd"/>
+      <w:r>
+        <w:rPr>
+          <w:lang w:bidi="hi-IN"/>
+        </w:rPr>
+        <w:t xml:space="preserve">, K.; Basson, A. E. K103N, V106M and Y188L Significantly Reduce HIV-1 Subtype C Phenotypic Susceptibility to Doravirine. </w:t>
       </w:r>
       <w:r>
         <w:rPr>
@@ -29609,14 +31166,21 @@
           <w:lang w:bidi="hi-IN"/>
         </w:rPr>
         <w:tab/>
-        <w:t xml:space="preserve">Ghosh, M.; Jacques, P. S.; Rodgers, D. W.; Ottman, M.; Darlix, J.-L.; Le Grice, S. F. J. Alterations to the Primer Grip of P66 HIV-1 Reverse Transcriptase and Their Consequences </w:t>
-      </w:r>
-      <w:r>
-        <w:rPr>
-          <w:lang w:bidi="hi-IN"/>
-        </w:rPr>
-        <w:lastRenderedPageBreak/>
-        <w:t xml:space="preserve">for Template-Primer Utilization. </w:t>
+        <w:t xml:space="preserve">Ghosh, M.; Jacques, P. S.; Rodgers, D. W.; Ottman, M.; </w:t>
+      </w:r>
+      <w:proofErr w:type="spellStart"/>
+      <w:r>
+        <w:rPr>
+          <w:lang w:bidi="hi-IN"/>
+        </w:rPr>
+        <w:t>Darlix</w:t>
+      </w:r>
+      <w:proofErr w:type="spellEnd"/>
+      <w:r>
+        <w:rPr>
+          <w:lang w:bidi="hi-IN"/>
+        </w:rPr>
+        <w:t xml:space="preserve">, J.-L.; Le Grice, S. F. J. Alterations to the Primer Grip of P66 HIV-1 Reverse Transcriptase and Their Consequences for Template-Primer Utilization. </w:t>
       </w:r>
       <w:r>
         <w:rPr>
@@ -29805,7 +31369,21 @@
           <w:lang w:bidi="hi-IN"/>
         </w:rPr>
         <w:tab/>
-        <w:t xml:space="preserve">Taguchi, M.; Oyama, R.; Kaneso, M.; Hayashi, S. Hybrid QM/MM Free-Energy Evaluation of Drug-Resistant Mutational Effect on the Binding of an Inhibitor Indinavir to HIV‑1 Protease. </w:t>
+        <w:t xml:space="preserve">Taguchi, M.; Oyama, R.; </w:t>
+      </w:r>
+      <w:proofErr w:type="spellStart"/>
+      <w:r>
+        <w:rPr>
+          <w:lang w:bidi="hi-IN"/>
+        </w:rPr>
+        <w:t>Kaneso</w:t>
+      </w:r>
+      <w:proofErr w:type="spellEnd"/>
+      <w:r>
+        <w:rPr>
+          <w:lang w:bidi="hi-IN"/>
+        </w:rPr>
+        <w:t xml:space="preserve">, M.; Hayashi, S. Hybrid QM/MM Free-Energy Evaluation of Drug-Resistant Mutational Effect on the Binding of an Inhibitor Indinavir to HIV‑1 Protease. </w:t>
       </w:r>
       <w:r>
         <w:rPr>
@@ -29931,7 +31509,21 @@
           <w:lang w:bidi="hi-IN"/>
         </w:rPr>
         <w:tab/>
-        <w:t xml:space="preserve">Tiwary, P.; Limongelli, V.; Salvalaglio, M.; Parrinello, M. Kinetics of Protein–Ligand Unbinding: Predicting Pathways, Rates, and Rate-Limiting Steps. </w:t>
+        <w:t xml:space="preserve">Tiwary, P.; Limongelli, V.; </w:t>
+      </w:r>
+      <w:proofErr w:type="spellStart"/>
+      <w:r>
+        <w:rPr>
+          <w:lang w:bidi="hi-IN"/>
+        </w:rPr>
+        <w:t>Salvalaglio</w:t>
+      </w:r>
+      <w:proofErr w:type="spellEnd"/>
+      <w:r>
+        <w:rPr>
+          <w:lang w:bidi="hi-IN"/>
+        </w:rPr>
+        <w:t xml:space="preserve">, M.; Parrinello, M. Kinetics of Protein–Ligand Unbinding: Predicting Pathways, Rates, and Rate-Limiting Steps. </w:t>
       </w:r>
       <w:r>
         <w:rPr>
@@ -29987,6 +31579,7 @@
         <w:rPr>
           <w:lang w:bidi="hi-IN"/>
         </w:rPr>
+        <w:lastRenderedPageBreak/>
         <w:t>(85)</w:t>
       </w:r>
       <w:r>
@@ -29994,7 +31587,21 @@
           <w:lang w:bidi="hi-IN"/>
         </w:rPr>
         <w:tab/>
-        <w:t xml:space="preserve">Jagger, B. R.; Ojha, A. A.; Amaro, R. E. Predicting Ligand Binding Kinetics Using a Markovian Milestoning with Voronoi Tessellations Multiscale Approach. </w:t>
+        <w:t xml:space="preserve">Jagger, B. R.; Ojha, A. A.; Amaro, R. E. Predicting Ligand Binding Kinetics Using a Markovian </w:t>
+      </w:r>
+      <w:proofErr w:type="spellStart"/>
+      <w:r>
+        <w:rPr>
+          <w:lang w:bidi="hi-IN"/>
+        </w:rPr>
+        <w:t>Milestoning</w:t>
+      </w:r>
+      <w:proofErr w:type="spellEnd"/>
+      <w:r>
+        <w:rPr>
+          <w:lang w:bidi="hi-IN"/>
+        </w:rPr>
+        <w:t xml:space="preserve"> with Voronoi Tessellations Multiscale Approach. </w:t>
       </w:r>
       <w:r>
         <w:rPr>
@@ -30002,7 +31609,25 @@
           <w:iCs/>
           <w:lang w:bidi="hi-IN"/>
         </w:rPr>
-        <w:t>J. Chem. Theory Comput.</w:t>
+        <w:t xml:space="preserve">J. Chem. Theory </w:t>
+      </w:r>
+      <w:proofErr w:type="spellStart"/>
+      <w:r>
+        <w:rPr>
+          <w:i/>
+          <w:iCs/>
+          <w:lang w:bidi="hi-IN"/>
+        </w:rPr>
+        <w:t>Comput</w:t>
+      </w:r>
+      <w:proofErr w:type="spellEnd"/>
+      <w:r>
+        <w:rPr>
+          <w:i/>
+          <w:iCs/>
+          <w:lang w:bidi="hi-IN"/>
+        </w:rPr>
+        <w:t>.</w:t>
       </w:r>
       <w:r>
         <w:rPr>
@@ -30057,7 +31682,35 @@
           <w:lang w:bidi="hi-IN"/>
         </w:rPr>
         <w:tab/>
-        <w:t>Corso, G.; Stärk, H.; Jing, B.; Barzilay, R.; Jaakkola, T. DiffDock: Diffusion Steps, Twists, and Turns for Molecular Docking. arXiv February 11, 2023. https://doi.org/10.48550/arXiv.2210.01776</w:t>
+        <w:t xml:space="preserve">Corso, G.; </w:t>
+      </w:r>
+      <w:proofErr w:type="spellStart"/>
+      <w:r>
+        <w:rPr>
+          <w:lang w:bidi="hi-IN"/>
+        </w:rPr>
+        <w:t>Stärk</w:t>
+      </w:r>
+      <w:proofErr w:type="spellEnd"/>
+      <w:r>
+        <w:rPr>
+          <w:lang w:bidi="hi-IN"/>
+        </w:rPr>
+        <w:t xml:space="preserve">, H.; Jing, B.; Barzilay, R.; Jaakkola, T. </w:t>
+      </w:r>
+      <w:proofErr w:type="spellStart"/>
+      <w:r>
+        <w:rPr>
+          <w:lang w:bidi="hi-IN"/>
+        </w:rPr>
+        <w:t>DiffDock</w:t>
+      </w:r>
+      <w:proofErr w:type="spellEnd"/>
+      <w:r>
+        <w:rPr>
+          <w:lang w:bidi="hi-IN"/>
+        </w:rPr>
+        <w:t>: Diffusion Steps, Twists, and Turns for Molecular Docking. arXiv February 11, 2023. https://doi.org/10.48550/arXiv.2210.01776</w:t>
       </w:r>
     </w:p>
     <w:p>
@@ -30078,7 +31731,35 @@
           <w:lang w:bidi="hi-IN"/>
         </w:rPr>
         <w:tab/>
-        <w:t>Wohlwend, J.; Corso, G.; Passaro, S.; Getz, N.; Reveiz, M.; Leidal, K.; Swiderski, W.; Atkinson, L.; Portnoi, T.; Chinn, I.; Silterra, J.; Jaakkola, T.; Barzilay, R. Boltz-1 Democratizing Biomolecular Interaction Modeling. bioRxiv May 6, 2025, p 2024.11.19.624167. https://doi.org/10.1101/2024.11.19.624167</w:t>
+        <w:t xml:space="preserve">Wohlwend, J.; Corso, G.; Passaro, S.; Getz, N.; Reveiz, M.; Leidal, K.; Swiderski, W.; Atkinson, L.; </w:t>
+      </w:r>
+      <w:proofErr w:type="spellStart"/>
+      <w:r>
+        <w:rPr>
+          <w:lang w:bidi="hi-IN"/>
+        </w:rPr>
+        <w:t>Portnoi</w:t>
+      </w:r>
+      <w:proofErr w:type="spellEnd"/>
+      <w:r>
+        <w:rPr>
+          <w:lang w:bidi="hi-IN"/>
+        </w:rPr>
+        <w:t xml:space="preserve">, T.; Chinn, I.; </w:t>
+      </w:r>
+      <w:proofErr w:type="spellStart"/>
+      <w:r>
+        <w:rPr>
+          <w:lang w:bidi="hi-IN"/>
+        </w:rPr>
+        <w:t>Silterra</w:t>
+      </w:r>
+      <w:proofErr w:type="spellEnd"/>
+      <w:r>
+        <w:rPr>
+          <w:lang w:bidi="hi-IN"/>
+        </w:rPr>
+        <w:t>, J.; Jaakkola, T.; Barzilay, R. Boltz-1 Democratizing Biomolecular Interaction Modeling. bioRxiv May 6, 2025, p 2024.11.19.624167. https://doi.org/10.1101/2024.11.19.624167</w:t>
       </w:r>
     </w:p>
     <w:p>
@@ -30099,7 +31780,49 @@
           <w:lang w:bidi="hi-IN"/>
         </w:rPr>
         <w:tab/>
-        <w:t>Passaro, S.; Corso, G.; Wohlwend, J.; Reveiz, M.; Thaler, S.; Somnath, V. R.; Getz, N.; Portnoi, T.; Roy, J.; Stark, H.; Kwabi-Addo, D.; Beaini, D.; Jaakkola, T.; Barzilay, R. Boltz-2: Towards Accurate and Efficient Binding Affinity Prediction. bioRxiv June 18, 2025, p 2025.06.14.659707. https://doi.org/10.1101/2025.06.14.659707</w:t>
+        <w:t xml:space="preserve">Passaro, S.; Corso, G.; Wohlwend, J.; Reveiz, M.; Thaler, S.; Somnath, V. R.; Getz, N.; </w:t>
+      </w:r>
+      <w:proofErr w:type="spellStart"/>
+      <w:r>
+        <w:rPr>
+          <w:lang w:bidi="hi-IN"/>
+        </w:rPr>
+        <w:t>Portnoi</w:t>
+      </w:r>
+      <w:proofErr w:type="spellEnd"/>
+      <w:r>
+        <w:rPr>
+          <w:lang w:bidi="hi-IN"/>
+        </w:rPr>
+        <w:t xml:space="preserve">, T.; Roy, J.; Stark, H.; </w:t>
+      </w:r>
+      <w:proofErr w:type="spellStart"/>
+      <w:r>
+        <w:rPr>
+          <w:lang w:bidi="hi-IN"/>
+        </w:rPr>
+        <w:t>Kwabi</w:t>
+      </w:r>
+      <w:proofErr w:type="spellEnd"/>
+      <w:r>
+        <w:rPr>
+          <w:lang w:bidi="hi-IN"/>
+        </w:rPr>
+        <w:t xml:space="preserve">-Addo, D.; </w:t>
+      </w:r>
+      <w:proofErr w:type="spellStart"/>
+      <w:r>
+        <w:rPr>
+          <w:lang w:bidi="hi-IN"/>
+        </w:rPr>
+        <w:t>Beaini</w:t>
+      </w:r>
+      <w:proofErr w:type="spellEnd"/>
+      <w:r>
+        <w:rPr>
+          <w:lang w:bidi="hi-IN"/>
+        </w:rPr>
+        <w:t>, D.; Jaakkola, T.; Barzilay, R. Boltz-2: Towards Accurate and Efficient Binding Affinity Prediction. bioRxiv June 18, 2025, p 2025.06.14.659707. https://doi.org/10.1101/2025.06.14.659707</w:t>
       </w:r>
     </w:p>
     <w:p>
@@ -31183,7 +32906,6 @@
   <w:style w:type="character" w:default="1" w:styleId="DefaultParagraphFont">
     <w:name w:val="Default Paragraph Font"/>
     <w:uiPriority w:val="1"/>
-    <w:semiHidden/>
     <w:unhideWhenUsed/>
   </w:style>
   <w:style w:type="table" w:default="1" w:styleId="TableNormal">

</xml_diff>

<commit_message>
Supplementary Tables 6 and 7, and a cover page that matches the SI
Table 6 is the ligand charge model (Gasteiger against AM1-BCC on the same
trajectories and snapshots, plus the per-atom charges); Table 7 is the
unliganded and bound NNIBP volume with the crystal reference. Both follow
the Tables 1-5 shape: the summary, the per-replicate values behind it, and
a Notes sheet.

The cover page still described five Supplementary Figures and said Table 5
covered six genotypes rather than all 19, and listed nothing past Table 5.

Restructuring the Supplementary Text into numbered sections left five
dangling 'Supplementary Note N' cross-references in the manuscript. Mapped
each by the table it cites: Note 1 -> Section 3, Note 2 -> 4, Note 3 -> 7,
Note 4 -> 5. The QA check hardcoded the old name and is repointed.

Co-Authored-By: Claude Opus 5 <noreply@anthropic.com>
</commit_message>
<xml_diff>
--- a/revisions/Manuscript-Revision-1-CLEAN.docx
+++ b/revisions/Manuscript-Revision-1-CLEAN.docx
@@ -1906,7 +1906,7 @@
         <w:fldChar w:fldCharType="end"/>
       </w:r>
       <w:r>
-        <w:t xml:space="preserve"> The effect of this choice on the MM/GBSA energies is quantified in Supplementary Note 2 and Supplementary Table 6.</w:t>
+        <w:t xml:space="preserve"> The effect of this choice on the MM/GBSA energies is quantified in Supplementary Section 4 and Supplementary Table 6.</w:t>
       </w:r>
       <w:r>
         <w:t xml:space="preserve"> Each complex was solvated in a TIP3P periodic box with 1.0 nm padding and neutralized at 0.15 M ionic strength. Nonbonded interactions used particle-mesh Ewald electrostatics</w:t>
@@ -2747,7 +2747,7 @@
       </w:r>
       <w:proofErr w:type="spellEnd"/>
       <w:r>
-        <w:t xml:space="preserve"> and of each component to it, recomputing a subset of genotypes under single-point evaluation and under hydrogen-only relaxation with heavy atoms restrained (Supplementary Note 4 and Supplementary Table 5). It bears on the MM/GBSA column only: ΔΔGbind, which carries the principal claim, is an alchemical free energy and involves no snapshot minimization.</w:t>
+        <w:t xml:space="preserve"> and of each component to it, recomputing a subset of genotypes under single-point evaluation and under hydrogen-only relaxation with heavy atoms restrained (Supplementary Section 5 and Supplementary Table 5). It bears on the MM/GBSA column only: ΔΔGbind, which carries the principal claim, is an alchemical free energy and involves no snapshot minimization.</w:t>
       </w:r>
     </w:p>
     <w:p>
@@ -5684,7 +5684,7 @@
         <w:t xml:space="preserve"> </w:t>
       </w:r>
       <w:r>
-        <w:t>(Supplementary Note 1)</w:t>
+        <w:t>(Supplementary Section 3)</w:t>
       </w:r>
       <w:r>
         <w:t>.</w:t>
@@ -24046,7 +24046,7 @@
       </w:r>
       <w:r>
         <w:lastRenderedPageBreak/>
-        <w:t xml:space="preserve">between the two states was larger than in wild type for all three genotypes whose ΔΔGbind misses the phenotype (Supplementary Note 3 and Supplementary Table 7). ΔΔGbind is therefore least sensitive to the mechanism these genotypes appear to use. </w:t>
+        <w:t xml:space="preserve">between the two states was larger than in wild type for all three genotypes whose ΔΔGbind misses the phenotype (Supplementary Section 7 and Supplementary Table 7). ΔΔGbind is therefore least sensitive to the mechanism these genotypes appear to use. </w:t>
       </w:r>
       <w:r>
         <w:t>More generally, resistance can act through large-scale allosteric change, through the conformational equilibrium of the unliganded pocket on timescales far longer than we sample, or through effects on enzyme processivity and viral fitness, none of which are captured in these calculations. Such mechanisms are in principle accessible to hybrid QM/MM approaches,</w:t>
@@ -24280,7 +24280,7 @@
         <w:spacing w:after="240"/>
       </w:pPr>
       <w:r>
-        <w:t>DOR parameters were generated with Gasteiger partial charges, which are less accurate for drug-like molecules than AM1-BCC or RESP. The choice matters more for MM/GBSA than for the alchemical calculation. MM/GBSA evaluates an absolute interaction energy, so its electrostatic and polar solvation terms depend directly on the ligand charges. The alchemical calculation changes the protein, not the ligand. DOR is neutral and carries identical parameters at both end states of every leg, so its contribution largely cancels. We re-scored the same trajectories with AM1-BCC charges to check this. The WT-referenced ΔΔETotal moved by at most 0.81 kcal/mol and kept its sign for every genotype tested (Supplementary Note 2 and Supplementary Table 6).</w:t>
+        <w:t>DOR parameters were generated with Gasteiger partial charges, which are less accurate for drug-like molecules than AM1-BCC or RESP. The choice matters more for MM/GBSA than for the alchemical calculation. MM/GBSA evaluates an absolute interaction energy, so its electrostatic and polar solvation terms depend directly on the ligand charges. The alchemical calculation changes the protein, not the ligand. DOR is neutral and carries identical parameters at both end states of every leg, so its contribution largely cancels. We re-scored the same trajectories with AM1-BCC charges to check this. The WT-referenced ΔΔETotal moved by at most 0.81 kcal/mol and kept its sign for every genotype tested (Supplementary Section 4 and Supplementary Table 6).</w:t>
       </w:r>
     </w:p>
     <w:p>

</xml_diff>

<commit_message>
Methods: state the FEP charge model, which is AM1-BCC, not Gasteiger
Methods said DOR parameters were 'carried over from the OpenFF 2.0.0
assignment', which reads as the Gasteiger charges used for the equilibrium
MD. They were not carried over. export_dor_itp.py hands
Interchange.from_smirnoff a molecule with no partial charges, so Sage 2.0.0
runs its default ToolkitAM1BCC handler and assigns them fresh.

Checked against the production topology that fep/config.py points at: its
DOR charges are bit-identical to AM1-BCC (RMS 0.00000) and differ from
Gasteiger by RMS 0.165 e, max 0.390 e. The two were computed by independent
routes, AmberTools assign_partial_charges and SMIRNOFF, so the agreement is
not circular.

So the alchemical legs sampled and scored with AM1-BCC throughout, while
Gasteiger is confined to the equilibrium MD and the MM/GBSA column.

Co-Authored-By: Claude Opus 5 <noreply@anthropic.com>
</commit_message>
<xml_diff>
--- a/revisions/Manuscript-Revision-1-CLEAN.docx
+++ b/revisions/Manuscript-Revision-1-CLEAN.docx
@@ -4019,7 +4019,10 @@
         <w:fldChar w:fldCharType="end"/>
       </w:r>
       <w:r>
-        <w:t xml:space="preserve"> which share a common backbone and carry dummy atoms only where the two side chains differ, built with the amber14sbmut mutation force field to match the ff14SB parameters used for MD; DOR parameters were carried over from the </w:t>
+        <w:t xml:space="preserve"> which share a common backbone and carry dummy atoms only where the two side chains differ, built with the amber14sbmut mutation force field to match the ff14SB parameters used for MD; </w:t>
+      </w:r>
+      <w:r>
+        <w:t xml:space="preserve">DOR was parameterized for the alchemical legs with the </w:t>
       </w:r>
       <w:proofErr w:type="spellStart"/>
       <w:r>
@@ -4027,7 +4030,13 @@
       </w:r>
       <w:proofErr w:type="spellEnd"/>
       <w:r>
-        <w:t xml:space="preserve"> 2.0.0 assignment and exported to GROMACS format through </w:t>
+        <w:t xml:space="preserve"> 2.0.0 </w:t>
+      </w:r>
+      <w:r>
+        <w:t xml:space="preserve">force field and its default AM1-BCC partial charges, not the Gasteiger charges used for the equilibrium MD and MM/GBSA, and</w:t>
+      </w:r>
+      <w:r>
+        <w:t xml:space="preserve"> exported to GROMACS format through </w:t>
       </w:r>
       <w:proofErr w:type="spellStart"/>
       <w:r>

</xml_diff>